<commit_message>
feature: Se realiza investigacion y recopilacion de nuevas referencias segun lo solicitado
</commit_message>
<xml_diff>
--- a/docs/DocumentoUniversidad/references/Analisis de referencias.docx
+++ b/docs/DocumentoUniversidad/references/Analisis de referencias.docx
@@ -64,6 +64,7 @@
           <w:lang w:val="en-US"/>
         </w:rPr>
       </w:pPr>
+      <w:proofErr w:type="spellStart"/>
       <w:r>
         <w:rPr>
           <w:rFonts w:asciiTheme="minorHAnsi" w:hAnsiTheme="minorHAnsi" w:cstheme="minorHAnsi"/>
@@ -72,6 +73,7 @@
         </w:rPr>
         <w:t>della</w:t>
       </w:r>
+      <w:proofErr w:type="spellEnd"/>
       <w:r>
         <w:rPr>
           <w:rFonts w:asciiTheme="minorHAnsi" w:hAnsiTheme="minorHAnsi" w:cstheme="minorHAnsi"/>
@@ -1256,13 +1258,23 @@
         </w:rPr>
         <w:t xml:space="preserve"> </w:t>
       </w:r>
-      <w:r>
-        <w:rPr>
-          <w:rFonts w:asciiTheme="minorHAnsi" w:hAnsiTheme="minorHAnsi" w:cstheme="minorHAnsi"/>
-          <w:sz w:val="24"/>
-          <w:szCs w:val="24"/>
-        </w:rPr>
-        <w:t>Leva,</w:t>
+      <w:proofErr w:type="gramStart"/>
+      <w:r>
+        <w:rPr>
+          <w:rFonts w:asciiTheme="minorHAnsi" w:hAnsiTheme="minorHAnsi" w:cstheme="minorHAnsi"/>
+          <w:sz w:val="24"/>
+          <w:szCs w:val="24"/>
+        </w:rPr>
+        <w:t>Leva</w:t>
+      </w:r>
+      <w:proofErr w:type="gramEnd"/>
+      <w:r>
+        <w:rPr>
+          <w:rFonts w:asciiTheme="minorHAnsi" w:hAnsiTheme="minorHAnsi" w:cstheme="minorHAnsi"/>
+          <w:sz w:val="24"/>
+          <w:szCs w:val="24"/>
+        </w:rPr>
+        <w:t>,</w:t>
       </w:r>
       <w:r>
         <w:rPr>
@@ -1666,6 +1678,7 @@
         </w:rPr>
         <w:t xml:space="preserve"> </w:t>
       </w:r>
+      <w:proofErr w:type="spellStart"/>
       <w:r>
         <w:rPr>
           <w:rFonts w:asciiTheme="minorHAnsi" w:hAnsiTheme="minorHAnsi" w:cstheme="minorHAnsi"/>
@@ -1674,6 +1687,7 @@
         </w:rPr>
         <w:t>Education</w:t>
       </w:r>
+      <w:proofErr w:type="spellEnd"/>
       <w:r>
         <w:rPr>
           <w:rFonts w:asciiTheme="minorHAnsi" w:hAnsiTheme="minorHAnsi" w:cstheme="minorHAnsi"/>
@@ -1700,6 +1714,7 @@
         </w:rPr>
         <w:t xml:space="preserve"> </w:t>
       </w:r>
+      <w:proofErr w:type="spellStart"/>
       <w:r>
         <w:rPr>
           <w:rFonts w:asciiTheme="minorHAnsi" w:hAnsiTheme="minorHAnsi" w:cstheme="minorHAnsi"/>
@@ -1708,15 +1723,17 @@
         </w:rPr>
         <w:t>Information</w:t>
       </w:r>
-      <w:r>
-        <w:rPr>
-          <w:rFonts w:asciiTheme="minorHAnsi" w:hAnsiTheme="minorHAnsi" w:cstheme="minorHAnsi"/>
-          <w:spacing w:val="-4"/>
-          <w:sz w:val="24"/>
-          <w:szCs w:val="24"/>
-        </w:rPr>
-        <w:t xml:space="preserve"> </w:t>
-      </w:r>
+      <w:proofErr w:type="spellEnd"/>
+      <w:r>
+        <w:rPr>
+          <w:rFonts w:asciiTheme="minorHAnsi" w:hAnsiTheme="minorHAnsi" w:cstheme="minorHAnsi"/>
+          <w:spacing w:val="-4"/>
+          <w:sz w:val="24"/>
+          <w:szCs w:val="24"/>
+        </w:rPr>
+        <w:t xml:space="preserve"> </w:t>
+      </w:r>
+      <w:proofErr w:type="spellStart"/>
       <w:r>
         <w:rPr>
           <w:rFonts w:asciiTheme="minorHAnsi" w:hAnsiTheme="minorHAnsi" w:cstheme="minorHAnsi"/>
@@ -1725,6 +1742,7 @@
         </w:rPr>
         <w:t>Systems</w:t>
       </w:r>
+      <w:proofErr w:type="spellEnd"/>
       <w:r>
         <w:rPr>
           <w:rFonts w:asciiTheme="minorHAnsi" w:hAnsiTheme="minorHAnsi" w:cstheme="minorHAnsi"/>
@@ -2829,55 +2847,7 @@
           <w:sz w:val="24"/>
           <w:szCs w:val="24"/>
         </w:rPr>
-        <w:t>El enfoque biopsicosocial y</w:t>
-      </w:r>
-      <w:r>
-        <w:rPr>
-          <w:rFonts w:asciiTheme="minorHAnsi" w:hAnsiTheme="minorHAnsi" w:cstheme="minorHAnsi"/>
-          <w:sz w:val="24"/>
-          <w:szCs w:val="24"/>
-        </w:rPr>
-        <w:t xml:space="preserve"> </w:t>
-      </w:r>
-      <w:r>
-        <w:rPr>
-          <w:rFonts w:asciiTheme="minorHAnsi" w:hAnsiTheme="minorHAnsi" w:cstheme="minorHAnsi"/>
-          <w:sz w:val="24"/>
-          <w:szCs w:val="24"/>
-        </w:rPr>
-        <w:t xml:space="preserve">cultural en la formación </w:t>
-      </w:r>
-      <w:r>
-        <w:rPr>
-          <w:rFonts w:asciiTheme="minorHAnsi" w:hAnsiTheme="minorHAnsi" w:cstheme="minorHAnsi"/>
-          <w:sz w:val="24"/>
-          <w:szCs w:val="24"/>
-        </w:rPr>
-        <w:t>de los</w:t>
-      </w:r>
-      <w:r>
-        <w:rPr>
-          <w:rFonts w:asciiTheme="minorHAnsi" w:hAnsiTheme="minorHAnsi" w:cstheme="minorHAnsi"/>
-          <w:sz w:val="24"/>
-          <w:szCs w:val="24"/>
-        </w:rPr>
-        <w:t xml:space="preserve"> profesionales de la salud en</w:t>
-      </w:r>
-      <w:r>
-        <w:rPr>
-          <w:rFonts w:asciiTheme="minorHAnsi" w:hAnsiTheme="minorHAnsi" w:cstheme="minorHAnsi"/>
-          <w:sz w:val="24"/>
-          <w:szCs w:val="24"/>
-        </w:rPr>
-        <w:t xml:space="preserve"> </w:t>
-      </w:r>
-      <w:r>
-        <w:rPr>
-          <w:rFonts w:asciiTheme="minorHAnsi" w:hAnsiTheme="minorHAnsi" w:cstheme="minorHAnsi"/>
-          <w:sz w:val="24"/>
-          <w:szCs w:val="24"/>
-        </w:rPr>
-        <w:t>la Universidad El Bosque</w:t>
+        <w:t>El enfoque biopsicosocial y cultural en la formación de los profesionales de la salud en la Universidad El Bosque</w:t>
       </w:r>
       <w:r>
         <w:rPr>
@@ -4091,13 +4061,23 @@
         </w:rPr>
         <w:t xml:space="preserve"> </w:t>
       </w:r>
-      <w:r>
-        <w:rPr>
-          <w:rFonts w:asciiTheme="minorHAnsi" w:hAnsiTheme="minorHAnsi" w:cstheme="minorHAnsi"/>
-          <w:sz w:val="24"/>
-          <w:szCs w:val="24"/>
-        </w:rPr>
-        <w:t>Kaazhim,</w:t>
+      <w:proofErr w:type="spellStart"/>
+      <w:r>
+        <w:rPr>
+          <w:rFonts w:asciiTheme="minorHAnsi" w:hAnsiTheme="minorHAnsi" w:cstheme="minorHAnsi"/>
+          <w:sz w:val="24"/>
+          <w:szCs w:val="24"/>
+        </w:rPr>
+        <w:t>Kaazhim</w:t>
+      </w:r>
+      <w:proofErr w:type="spellEnd"/>
+      <w:r>
+        <w:rPr>
+          <w:rFonts w:asciiTheme="minorHAnsi" w:hAnsiTheme="minorHAnsi" w:cstheme="minorHAnsi"/>
+          <w:sz w:val="24"/>
+          <w:szCs w:val="24"/>
+        </w:rPr>
+        <w:t>,</w:t>
       </w:r>
       <w:r>
         <w:rPr>
@@ -4142,13 +4122,23 @@
         </w:rPr>
         <w:t xml:space="preserve"> </w:t>
       </w:r>
-      <w:r>
-        <w:rPr>
-          <w:rFonts w:asciiTheme="minorHAnsi" w:hAnsiTheme="minorHAnsi" w:cstheme="minorHAnsi"/>
-          <w:sz w:val="24"/>
-          <w:szCs w:val="24"/>
-        </w:rPr>
-        <w:t>Nugroho,</w:t>
+      <w:proofErr w:type="spellStart"/>
+      <w:r>
+        <w:rPr>
+          <w:rFonts w:asciiTheme="minorHAnsi" w:hAnsiTheme="minorHAnsi" w:cstheme="minorHAnsi"/>
+          <w:sz w:val="24"/>
+          <w:szCs w:val="24"/>
+        </w:rPr>
+        <w:t>Nugroho</w:t>
+      </w:r>
+      <w:proofErr w:type="spellEnd"/>
+      <w:r>
+        <w:rPr>
+          <w:rFonts w:asciiTheme="minorHAnsi" w:hAnsiTheme="minorHAnsi" w:cstheme="minorHAnsi"/>
+          <w:sz w:val="24"/>
+          <w:szCs w:val="24"/>
+        </w:rPr>
+        <w:t>,</w:t>
       </w:r>
       <w:r>
         <w:rPr>
@@ -5157,14 +5147,25 @@
         </w:rPr>
         <w:t xml:space="preserve"> </w:t>
       </w:r>
-      <w:r>
-        <w:rPr>
-          <w:rFonts w:asciiTheme="minorHAnsi" w:hAnsiTheme="minorHAnsi" w:cstheme="minorHAnsi"/>
-          <w:sz w:val="24"/>
-          <w:szCs w:val="24"/>
-          <w:lang w:val="en-US"/>
-        </w:rPr>
-        <w:t>Zhaku-Hani,</w:t>
+      <w:proofErr w:type="spellStart"/>
+      <w:r>
+        <w:rPr>
+          <w:rFonts w:asciiTheme="minorHAnsi" w:hAnsiTheme="minorHAnsi" w:cstheme="minorHAnsi"/>
+          <w:sz w:val="24"/>
+          <w:szCs w:val="24"/>
+          <w:lang w:val="en-US"/>
+        </w:rPr>
+        <w:t>Zhaku</w:t>
+      </w:r>
+      <w:proofErr w:type="spellEnd"/>
+      <w:r>
+        <w:rPr>
+          <w:rFonts w:asciiTheme="minorHAnsi" w:hAnsiTheme="minorHAnsi" w:cstheme="minorHAnsi"/>
+          <w:sz w:val="24"/>
+          <w:szCs w:val="24"/>
+          <w:lang w:val="en-US"/>
+        </w:rPr>
+        <w:t>-Hani,</w:t>
       </w:r>
       <w:r>
         <w:rPr>
@@ -6664,6 +6665,7 @@
         </w:rPr>
         <w:t xml:space="preserve"> </w:t>
       </w:r>
+      <w:proofErr w:type="spellStart"/>
       <w:r>
         <w:rPr>
           <w:rFonts w:asciiTheme="minorHAnsi" w:hAnsiTheme="minorHAnsi" w:cstheme="minorHAnsi"/>
@@ -6673,6 +6675,7 @@
         </w:rPr>
         <w:t>Characterisation</w:t>
       </w:r>
+      <w:proofErr w:type="spellEnd"/>
       <w:r>
         <w:rPr>
           <w:rFonts w:asciiTheme="minorHAnsi" w:hAnsiTheme="minorHAnsi" w:cstheme="minorHAnsi"/>
@@ -10504,13 +10507,23 @@
           <w:szCs w:val="24"/>
         </w:rPr>
       </w:pPr>
-      <w:r>
-        <w:rPr>
-          <w:rFonts w:asciiTheme="minorHAnsi" w:hAnsiTheme="minorHAnsi" w:cstheme="minorHAnsi"/>
-          <w:sz w:val="24"/>
-          <w:szCs w:val="24"/>
-        </w:rPr>
-        <w:t>Redcómputo.</w:t>
+      <w:proofErr w:type="spellStart"/>
+      <w:r>
+        <w:rPr>
+          <w:rFonts w:asciiTheme="minorHAnsi" w:hAnsiTheme="minorHAnsi" w:cstheme="minorHAnsi"/>
+          <w:sz w:val="24"/>
+          <w:szCs w:val="24"/>
+        </w:rPr>
+        <w:t>Redcómputo</w:t>
+      </w:r>
+      <w:proofErr w:type="spellEnd"/>
+      <w:r>
+        <w:rPr>
+          <w:rFonts w:asciiTheme="minorHAnsi" w:hAnsiTheme="minorHAnsi" w:cstheme="minorHAnsi"/>
+          <w:sz w:val="24"/>
+          <w:szCs w:val="24"/>
+        </w:rPr>
+        <w:t>.</w:t>
       </w:r>
       <w:r>
         <w:rPr>
@@ -11495,7 +11508,27 @@
           <w:szCs w:val="24"/>
           <w:lang w:val="en-US"/>
         </w:rPr>
-        <w:t>Al-Hunaiyyan,</w:t>
+        <w:t>Al-</w:t>
+      </w:r>
+      <w:proofErr w:type="spellStart"/>
+      <w:r>
+        <w:rPr>
+          <w:rFonts w:asciiTheme="minorHAnsi" w:hAnsiTheme="minorHAnsi" w:cstheme="minorHAnsi"/>
+          <w:sz w:val="24"/>
+          <w:szCs w:val="24"/>
+          <w:lang w:val="en-US"/>
+        </w:rPr>
+        <w:t>Hunaiyyan</w:t>
+      </w:r>
+      <w:proofErr w:type="spellEnd"/>
+      <w:r>
+        <w:rPr>
+          <w:rFonts w:asciiTheme="minorHAnsi" w:hAnsiTheme="minorHAnsi" w:cstheme="minorHAnsi"/>
+          <w:sz w:val="24"/>
+          <w:szCs w:val="24"/>
+          <w:lang w:val="en-US"/>
+        </w:rPr>
+        <w:t>,</w:t>
       </w:r>
       <w:r>
         <w:rPr>
@@ -11564,14 +11597,25 @@
         </w:rPr>
         <w:t xml:space="preserve"> </w:t>
       </w:r>
-      <w:r>
-        <w:rPr>
-          <w:rFonts w:asciiTheme="minorHAnsi" w:hAnsiTheme="minorHAnsi" w:cstheme="minorHAnsi"/>
-          <w:sz w:val="24"/>
-          <w:szCs w:val="24"/>
-          <w:lang w:val="en-US"/>
-        </w:rPr>
-        <w:t>Alghannam,</w:t>
+      <w:proofErr w:type="spellStart"/>
+      <w:r>
+        <w:rPr>
+          <w:rFonts w:asciiTheme="minorHAnsi" w:hAnsiTheme="minorHAnsi" w:cstheme="minorHAnsi"/>
+          <w:sz w:val="24"/>
+          <w:szCs w:val="24"/>
+          <w:lang w:val="en-US"/>
+        </w:rPr>
+        <w:t>Alghannam</w:t>
+      </w:r>
+      <w:proofErr w:type="spellEnd"/>
+      <w:r>
+        <w:rPr>
+          <w:rFonts w:asciiTheme="minorHAnsi" w:hAnsiTheme="minorHAnsi" w:cstheme="minorHAnsi"/>
+          <w:sz w:val="24"/>
+          <w:szCs w:val="24"/>
+          <w:lang w:val="en-US"/>
+        </w:rPr>
+        <w:t>,</w:t>
       </w:r>
       <w:r>
         <w:rPr>
@@ -11811,7 +11855,43 @@
           <w:szCs w:val="24"/>
         </w:rPr>
         <w:lastRenderedPageBreak/>
-        <w:t>desarrollo de LITARO, ya que analiza directamente la experiencia de usuario en Sistemas de Información Estudiantil (Student Information Systems). El estudio reconoce que la calidad técnica de un sistema</w:t>
+        <w:t xml:space="preserve">desarrollo de LITARO, ya que analiza directamente la experiencia de usuario en Sistemas de Información Estudiantil (Student </w:t>
+      </w:r>
+      <w:proofErr w:type="spellStart"/>
+      <w:r>
+        <w:rPr>
+          <w:rFonts w:asciiTheme="minorHAnsi" w:hAnsiTheme="minorHAnsi" w:cstheme="minorHAnsi"/>
+          <w:sz w:val="24"/>
+          <w:szCs w:val="24"/>
+        </w:rPr>
+        <w:t>Information</w:t>
+      </w:r>
+      <w:proofErr w:type="spellEnd"/>
+      <w:r>
+        <w:rPr>
+          <w:rFonts w:asciiTheme="minorHAnsi" w:hAnsiTheme="minorHAnsi" w:cstheme="minorHAnsi"/>
+          <w:sz w:val="24"/>
+          <w:szCs w:val="24"/>
+        </w:rPr>
+        <w:t xml:space="preserve"> </w:t>
+      </w:r>
+      <w:proofErr w:type="spellStart"/>
+      <w:r>
+        <w:rPr>
+          <w:rFonts w:asciiTheme="minorHAnsi" w:hAnsiTheme="minorHAnsi" w:cstheme="minorHAnsi"/>
+          <w:sz w:val="24"/>
+          <w:szCs w:val="24"/>
+        </w:rPr>
+        <w:t>Systems</w:t>
+      </w:r>
+      <w:proofErr w:type="spellEnd"/>
+      <w:r>
+        <w:rPr>
+          <w:rFonts w:asciiTheme="minorHAnsi" w:hAnsiTheme="minorHAnsi" w:cstheme="minorHAnsi"/>
+          <w:sz w:val="24"/>
+          <w:szCs w:val="24"/>
+        </w:rPr>
+        <w:t>). El estudio reconoce que la calidad técnica de un sistema</w:t>
       </w:r>
       <w:r>
         <w:rPr>
@@ -14434,7 +14514,25 @@
           <w:sz w:val="24"/>
           <w:szCs w:val="24"/>
         </w:rPr>
-        <w:t>conceptual. Sin embargo, su pertinencia dentro de esta investigación depende completamente de la arquitectura implementada en LITARO. Si el sistema fue diseñado utilizando principios orientados a servicios, APIs desacopladas o una arquitectura basada en servicios independientes, la referencia resulta plenamente justificable.</w:t>
+        <w:t xml:space="preserve">conceptual. Sin embargo, su pertinencia dentro de esta investigación depende completamente de la arquitectura implementada en LITARO. Si el sistema fue diseñado utilizando principios orientados a servicios, </w:t>
+      </w:r>
+      <w:proofErr w:type="spellStart"/>
+      <w:r>
+        <w:rPr>
+          <w:rFonts w:asciiTheme="minorHAnsi" w:hAnsiTheme="minorHAnsi" w:cstheme="minorHAnsi"/>
+          <w:sz w:val="24"/>
+          <w:szCs w:val="24"/>
+        </w:rPr>
+        <w:t>APIs</w:t>
+      </w:r>
+      <w:proofErr w:type="spellEnd"/>
+      <w:r>
+        <w:rPr>
+          <w:rFonts w:asciiTheme="minorHAnsi" w:hAnsiTheme="minorHAnsi" w:cstheme="minorHAnsi"/>
+          <w:sz w:val="24"/>
+          <w:szCs w:val="24"/>
+        </w:rPr>
+        <w:t xml:space="preserve"> desacopladas o una arquitectura basada en servicios independientes, la referencia resulta plenamente justificable.</w:t>
       </w:r>
     </w:p>
     <w:p>
@@ -15972,13 +16070,131 @@
         </w:rPr>
         <w:t xml:space="preserve"> </w:t>
       </w:r>
-      <w:r>
-        <w:rPr>
-          <w:rFonts w:asciiTheme="minorHAnsi" w:hAnsiTheme="minorHAnsi" w:cstheme="minorHAnsi"/>
-          <w:sz w:val="24"/>
-          <w:szCs w:val="24"/>
-        </w:rPr>
-        <w:t>Educational Digital Transformation: New Technological Challenges for Competence Development.</w:t>
+      <w:proofErr w:type="spellStart"/>
+      <w:r>
+        <w:rPr>
+          <w:rFonts w:asciiTheme="minorHAnsi" w:hAnsiTheme="minorHAnsi" w:cstheme="minorHAnsi"/>
+          <w:sz w:val="24"/>
+          <w:szCs w:val="24"/>
+        </w:rPr>
+        <w:t>Educational</w:t>
+      </w:r>
+      <w:proofErr w:type="spellEnd"/>
+      <w:r>
+        <w:rPr>
+          <w:rFonts w:asciiTheme="minorHAnsi" w:hAnsiTheme="minorHAnsi" w:cstheme="minorHAnsi"/>
+          <w:sz w:val="24"/>
+          <w:szCs w:val="24"/>
+        </w:rPr>
+        <w:t xml:space="preserve"> Digital </w:t>
+      </w:r>
+      <w:proofErr w:type="spellStart"/>
+      <w:r>
+        <w:rPr>
+          <w:rFonts w:asciiTheme="minorHAnsi" w:hAnsiTheme="minorHAnsi" w:cstheme="minorHAnsi"/>
+          <w:sz w:val="24"/>
+          <w:szCs w:val="24"/>
+        </w:rPr>
+        <w:t>Transformation</w:t>
+      </w:r>
+      <w:proofErr w:type="spellEnd"/>
+      <w:r>
+        <w:rPr>
+          <w:rFonts w:asciiTheme="minorHAnsi" w:hAnsiTheme="minorHAnsi" w:cstheme="minorHAnsi"/>
+          <w:sz w:val="24"/>
+          <w:szCs w:val="24"/>
+        </w:rPr>
+        <w:t xml:space="preserve">: New </w:t>
+      </w:r>
+      <w:proofErr w:type="spellStart"/>
+      <w:r>
+        <w:rPr>
+          <w:rFonts w:asciiTheme="minorHAnsi" w:hAnsiTheme="minorHAnsi" w:cstheme="minorHAnsi"/>
+          <w:sz w:val="24"/>
+          <w:szCs w:val="24"/>
+        </w:rPr>
+        <w:t>Technological</w:t>
+      </w:r>
+      <w:proofErr w:type="spellEnd"/>
+      <w:r>
+        <w:rPr>
+          <w:rFonts w:asciiTheme="minorHAnsi" w:hAnsiTheme="minorHAnsi" w:cstheme="minorHAnsi"/>
+          <w:sz w:val="24"/>
+          <w:szCs w:val="24"/>
+        </w:rPr>
+        <w:t xml:space="preserve"> </w:t>
+      </w:r>
+      <w:proofErr w:type="spellStart"/>
+      <w:r>
+        <w:rPr>
+          <w:rFonts w:asciiTheme="minorHAnsi" w:hAnsiTheme="minorHAnsi" w:cstheme="minorHAnsi"/>
+          <w:sz w:val="24"/>
+          <w:szCs w:val="24"/>
+        </w:rPr>
+        <w:t>Challenges</w:t>
+      </w:r>
+      <w:proofErr w:type="spellEnd"/>
+      <w:r>
+        <w:rPr>
+          <w:rFonts w:asciiTheme="minorHAnsi" w:hAnsiTheme="minorHAnsi" w:cstheme="minorHAnsi"/>
+          <w:sz w:val="24"/>
+          <w:szCs w:val="24"/>
+        </w:rPr>
+        <w:t xml:space="preserve"> </w:t>
+      </w:r>
+      <w:proofErr w:type="spellStart"/>
+      <w:r>
+        <w:rPr>
+          <w:rFonts w:asciiTheme="minorHAnsi" w:hAnsiTheme="minorHAnsi" w:cstheme="minorHAnsi"/>
+          <w:sz w:val="24"/>
+          <w:szCs w:val="24"/>
+        </w:rPr>
+        <w:t>for</w:t>
+      </w:r>
+      <w:proofErr w:type="spellEnd"/>
+      <w:r>
+        <w:rPr>
+          <w:rFonts w:asciiTheme="minorHAnsi" w:hAnsiTheme="minorHAnsi" w:cstheme="minorHAnsi"/>
+          <w:sz w:val="24"/>
+          <w:szCs w:val="24"/>
+        </w:rPr>
+        <w:t xml:space="preserve"> </w:t>
+      </w:r>
+      <w:proofErr w:type="spellStart"/>
+      <w:r>
+        <w:rPr>
+          <w:rFonts w:asciiTheme="minorHAnsi" w:hAnsiTheme="minorHAnsi" w:cstheme="minorHAnsi"/>
+          <w:sz w:val="24"/>
+          <w:szCs w:val="24"/>
+        </w:rPr>
+        <w:t>Competence</w:t>
+      </w:r>
+      <w:proofErr w:type="spellEnd"/>
+      <w:r>
+        <w:rPr>
+          <w:rFonts w:asciiTheme="minorHAnsi" w:hAnsiTheme="minorHAnsi" w:cstheme="minorHAnsi"/>
+          <w:sz w:val="24"/>
+          <w:szCs w:val="24"/>
+        </w:rPr>
+        <w:t xml:space="preserve"> </w:t>
+      </w:r>
+      <w:proofErr w:type="spellStart"/>
+      <w:r>
+        <w:rPr>
+          <w:rFonts w:asciiTheme="minorHAnsi" w:hAnsiTheme="minorHAnsi" w:cstheme="minorHAnsi"/>
+          <w:sz w:val="24"/>
+          <w:szCs w:val="24"/>
+        </w:rPr>
+        <w:t>Development</w:t>
+      </w:r>
+      <w:proofErr w:type="spellEnd"/>
+      <w:r>
+        <w:rPr>
+          <w:rFonts w:asciiTheme="minorHAnsi" w:hAnsiTheme="minorHAnsi" w:cstheme="minorHAnsi"/>
+          <w:sz w:val="24"/>
+          <w:szCs w:val="24"/>
+        </w:rPr>
+        <w:t>.</w:t>
       </w:r>
     </w:p>
     <w:p>
@@ -19221,14 +19437,25 @@
         </w:rPr>
         <w:t xml:space="preserve"> </w:t>
       </w:r>
-      <w:r>
-        <w:rPr>
-          <w:rFonts w:asciiTheme="minorHAnsi" w:hAnsiTheme="minorHAnsi" w:cstheme="minorHAnsi"/>
-          <w:sz w:val="24"/>
-          <w:szCs w:val="24"/>
-          <w:lang w:val="en-US"/>
-        </w:rPr>
-        <w:t>Dicheva,</w:t>
+      <w:proofErr w:type="spellStart"/>
+      <w:r>
+        <w:rPr>
+          <w:rFonts w:asciiTheme="minorHAnsi" w:hAnsiTheme="minorHAnsi" w:cstheme="minorHAnsi"/>
+          <w:sz w:val="24"/>
+          <w:szCs w:val="24"/>
+          <w:lang w:val="en-US"/>
+        </w:rPr>
+        <w:t>Dicheva</w:t>
+      </w:r>
+      <w:proofErr w:type="spellEnd"/>
+      <w:r>
+        <w:rPr>
+          <w:rFonts w:asciiTheme="minorHAnsi" w:hAnsiTheme="minorHAnsi" w:cstheme="minorHAnsi"/>
+          <w:sz w:val="24"/>
+          <w:szCs w:val="24"/>
+          <w:lang w:val="en-US"/>
+        </w:rPr>
+        <w:t>,</w:t>
       </w:r>
       <w:r>
         <w:rPr>
@@ -20433,7 +20660,27 @@
           <w:szCs w:val="24"/>
           <w:lang w:val="en-US"/>
         </w:rPr>
-        <w:t>Al Noor, S., Mustafa, G., Chowdhury, S. A., Hossain, M. Z., &amp; Jaigirdar, F. T. (2010). A Proposed</w:t>
+        <w:t xml:space="preserve">Al Noor, S., Mustafa, G., Chowdhury, S. A., Hossain, M. Z., &amp; </w:t>
+      </w:r>
+      <w:proofErr w:type="spellStart"/>
+      <w:r>
+        <w:rPr>
+          <w:rFonts w:asciiTheme="minorHAnsi" w:hAnsiTheme="minorHAnsi" w:cstheme="minorHAnsi"/>
+          <w:sz w:val="24"/>
+          <w:szCs w:val="24"/>
+          <w:lang w:val="en-US"/>
+        </w:rPr>
+        <w:t>Jaigirdar</w:t>
+      </w:r>
+      <w:proofErr w:type="spellEnd"/>
+      <w:r>
+        <w:rPr>
+          <w:rFonts w:asciiTheme="minorHAnsi" w:hAnsiTheme="minorHAnsi" w:cstheme="minorHAnsi"/>
+          <w:sz w:val="24"/>
+          <w:szCs w:val="24"/>
+          <w:lang w:val="en-US"/>
+        </w:rPr>
+        <w:t>, F. T. (2010). A Proposed</w:t>
       </w:r>
       <w:r>
         <w:rPr>
@@ -24260,7 +24507,43 @@
           <w:sz w:val="24"/>
           <w:szCs w:val="24"/>
         </w:rPr>
-        <w:t>de componentes de front-end y back-end para una base de datos académica. Desde la perspectiva de Ingeniería de Sistemas, constituye un antecedente interesante porque documenta decisiones de diseño, organización de la información y estructuración de componentes</w:t>
+        <w:t xml:space="preserve">de componentes de </w:t>
+      </w:r>
+      <w:proofErr w:type="spellStart"/>
+      <w:r>
+        <w:rPr>
+          <w:rFonts w:asciiTheme="minorHAnsi" w:hAnsiTheme="minorHAnsi" w:cstheme="minorHAnsi"/>
+          <w:sz w:val="24"/>
+          <w:szCs w:val="24"/>
+        </w:rPr>
+        <w:t>front-end</w:t>
+      </w:r>
+      <w:proofErr w:type="spellEnd"/>
+      <w:r>
+        <w:rPr>
+          <w:rFonts w:asciiTheme="minorHAnsi" w:hAnsiTheme="minorHAnsi" w:cstheme="minorHAnsi"/>
+          <w:sz w:val="24"/>
+          <w:szCs w:val="24"/>
+        </w:rPr>
+        <w:t xml:space="preserve"> y back-</w:t>
+      </w:r>
+      <w:proofErr w:type="spellStart"/>
+      <w:r>
+        <w:rPr>
+          <w:rFonts w:asciiTheme="minorHAnsi" w:hAnsiTheme="minorHAnsi" w:cstheme="minorHAnsi"/>
+          <w:sz w:val="24"/>
+          <w:szCs w:val="24"/>
+        </w:rPr>
+        <w:t>end</w:t>
+      </w:r>
+      <w:proofErr w:type="spellEnd"/>
+      <w:r>
+        <w:rPr>
+          <w:rFonts w:asciiTheme="minorHAnsi" w:hAnsiTheme="minorHAnsi" w:cstheme="minorHAnsi"/>
+          <w:sz w:val="24"/>
+          <w:szCs w:val="24"/>
+        </w:rPr>
+        <w:t xml:space="preserve"> para una base de datos académica. Desde la perspectiva de Ingeniería de Sistemas, constituye un antecedente interesante porque documenta decisiones de diseño, organización de la información y estructuración de componentes</w:t>
       </w:r>
       <w:r>
         <w:rPr>
@@ -24880,14 +25163,25 @@
           <w:lang w:val="en-US"/>
         </w:rPr>
       </w:pPr>
-      <w:r>
-        <w:rPr>
-          <w:rFonts w:asciiTheme="minorHAnsi" w:hAnsiTheme="minorHAnsi" w:cstheme="minorHAnsi"/>
-          <w:sz w:val="24"/>
-          <w:szCs w:val="24"/>
-          <w:lang w:val="en-US"/>
-        </w:rPr>
-        <w:t>Rodmunkong,</w:t>
+      <w:proofErr w:type="spellStart"/>
+      <w:r>
+        <w:rPr>
+          <w:rFonts w:asciiTheme="minorHAnsi" w:hAnsiTheme="minorHAnsi" w:cstheme="minorHAnsi"/>
+          <w:sz w:val="24"/>
+          <w:szCs w:val="24"/>
+          <w:lang w:val="en-US"/>
+        </w:rPr>
+        <w:t>Rodmunkong</w:t>
+      </w:r>
+      <w:proofErr w:type="spellEnd"/>
+      <w:r>
+        <w:rPr>
+          <w:rFonts w:asciiTheme="minorHAnsi" w:hAnsiTheme="minorHAnsi" w:cstheme="minorHAnsi"/>
+          <w:sz w:val="24"/>
+          <w:szCs w:val="24"/>
+          <w:lang w:val="en-US"/>
+        </w:rPr>
+        <w:t>,</w:t>
       </w:r>
       <w:r>
         <w:rPr>
@@ -24918,14 +25212,25 @@
         </w:rPr>
         <w:t xml:space="preserve"> </w:t>
       </w:r>
-      <w:r>
-        <w:rPr>
-          <w:rFonts w:asciiTheme="minorHAnsi" w:hAnsiTheme="minorHAnsi" w:cstheme="minorHAnsi"/>
-          <w:sz w:val="24"/>
-          <w:szCs w:val="24"/>
-          <w:lang w:val="en-US"/>
-        </w:rPr>
-        <w:t>Wannapiroon,</w:t>
+      <w:proofErr w:type="spellStart"/>
+      <w:r>
+        <w:rPr>
+          <w:rFonts w:asciiTheme="minorHAnsi" w:hAnsiTheme="minorHAnsi" w:cstheme="minorHAnsi"/>
+          <w:sz w:val="24"/>
+          <w:szCs w:val="24"/>
+          <w:lang w:val="en-US"/>
+        </w:rPr>
+        <w:t>Wannapiroon</w:t>
+      </w:r>
+      <w:proofErr w:type="spellEnd"/>
+      <w:r>
+        <w:rPr>
+          <w:rFonts w:asciiTheme="minorHAnsi" w:hAnsiTheme="minorHAnsi" w:cstheme="minorHAnsi"/>
+          <w:sz w:val="24"/>
+          <w:szCs w:val="24"/>
+          <w:lang w:val="en-US"/>
+        </w:rPr>
+        <w:t>,</w:t>
       </w:r>
       <w:r>
         <w:rPr>
@@ -24975,14 +25280,25 @@
         </w:rPr>
         <w:t xml:space="preserve"> </w:t>
       </w:r>
-      <w:r>
-        <w:rPr>
-          <w:rFonts w:asciiTheme="minorHAnsi" w:hAnsiTheme="minorHAnsi" w:cstheme="minorHAnsi"/>
-          <w:sz w:val="24"/>
-          <w:szCs w:val="24"/>
-          <w:lang w:val="en-US"/>
-        </w:rPr>
-        <w:t>Nilsook,</w:t>
+      <w:proofErr w:type="spellStart"/>
+      <w:r>
+        <w:rPr>
+          <w:rFonts w:asciiTheme="minorHAnsi" w:hAnsiTheme="minorHAnsi" w:cstheme="minorHAnsi"/>
+          <w:sz w:val="24"/>
+          <w:szCs w:val="24"/>
+          <w:lang w:val="en-US"/>
+        </w:rPr>
+        <w:t>Nilsook</w:t>
+      </w:r>
+      <w:proofErr w:type="spellEnd"/>
+      <w:r>
+        <w:rPr>
+          <w:rFonts w:asciiTheme="minorHAnsi" w:hAnsiTheme="minorHAnsi" w:cstheme="minorHAnsi"/>
+          <w:sz w:val="24"/>
+          <w:szCs w:val="24"/>
+          <w:lang w:val="en-US"/>
+        </w:rPr>
+        <w:t>,</w:t>
       </w:r>
       <w:r>
         <w:rPr>
@@ -26068,14 +26384,25 @@
         </w:rPr>
         <w:t xml:space="preserve"> </w:t>
       </w:r>
-      <w:r>
-        <w:rPr>
-          <w:rFonts w:asciiTheme="minorHAnsi" w:hAnsiTheme="minorHAnsi" w:cstheme="minorHAnsi"/>
-          <w:sz w:val="24"/>
-          <w:szCs w:val="24"/>
-          <w:lang w:val="en-US"/>
-        </w:rPr>
-        <w:t>Komarudin,</w:t>
+      <w:proofErr w:type="spellStart"/>
+      <w:r>
+        <w:rPr>
+          <w:rFonts w:asciiTheme="minorHAnsi" w:hAnsiTheme="minorHAnsi" w:cstheme="minorHAnsi"/>
+          <w:sz w:val="24"/>
+          <w:szCs w:val="24"/>
+          <w:lang w:val="en-US"/>
+        </w:rPr>
+        <w:t>Komarudin</w:t>
+      </w:r>
+      <w:proofErr w:type="spellEnd"/>
+      <w:r>
+        <w:rPr>
+          <w:rFonts w:asciiTheme="minorHAnsi" w:hAnsiTheme="minorHAnsi" w:cstheme="minorHAnsi"/>
+          <w:sz w:val="24"/>
+          <w:szCs w:val="24"/>
+          <w:lang w:val="en-US"/>
+        </w:rPr>
+        <w:t>,</w:t>
       </w:r>
       <w:r>
         <w:rPr>
@@ -26541,7 +26868,25 @@
           <w:sz w:val="24"/>
           <w:szCs w:val="24"/>
         </w:rPr>
-        <w:t>proyecto desarrollado. Los autores presentan la aplicación de la metodología Extreme Programming (XP) para el desarrollo de un sistema encargado del registro de información académica, situación muy similar a la planteada por LITARO.</w:t>
+        <w:t xml:space="preserve">proyecto desarrollado. Los autores presentan la aplicación de la metodología Extreme </w:t>
+      </w:r>
+      <w:proofErr w:type="spellStart"/>
+      <w:r>
+        <w:rPr>
+          <w:rFonts w:asciiTheme="minorHAnsi" w:hAnsiTheme="minorHAnsi" w:cstheme="minorHAnsi"/>
+          <w:sz w:val="24"/>
+          <w:szCs w:val="24"/>
+        </w:rPr>
+        <w:t>Programming</w:t>
+      </w:r>
+      <w:proofErr w:type="spellEnd"/>
+      <w:r>
+        <w:rPr>
+          <w:rFonts w:asciiTheme="minorHAnsi" w:hAnsiTheme="minorHAnsi" w:cstheme="minorHAnsi"/>
+          <w:sz w:val="24"/>
+          <w:szCs w:val="24"/>
+        </w:rPr>
+        <w:t xml:space="preserve"> (XP) para el desarrollo de un sistema encargado del registro de información académica, situación muy similar a la planteada por LITARO.</w:t>
       </w:r>
     </w:p>
     <w:p>
@@ -27734,7 +28079,25 @@
           <w:sz w:val="24"/>
           <w:szCs w:val="24"/>
         </w:rPr>
-        <w:t>su principal limitación radica en el origen de la fuente. Panorama Education es una empresa dedicada al desarrollo de soluciones tecnológicas para instituciones educativas, por lo que el documento posee un carácter principalmente comercial.</w:t>
+        <w:t xml:space="preserve">su principal limitación radica en el origen de la fuente. Panorama </w:t>
+      </w:r>
+      <w:proofErr w:type="spellStart"/>
+      <w:r>
+        <w:rPr>
+          <w:rFonts w:asciiTheme="minorHAnsi" w:hAnsiTheme="minorHAnsi" w:cstheme="minorHAnsi"/>
+          <w:sz w:val="24"/>
+          <w:szCs w:val="24"/>
+        </w:rPr>
+        <w:t>Education</w:t>
+      </w:r>
+      <w:proofErr w:type="spellEnd"/>
+      <w:r>
+        <w:rPr>
+          <w:rFonts w:asciiTheme="minorHAnsi" w:hAnsiTheme="minorHAnsi" w:cstheme="minorHAnsi"/>
+          <w:sz w:val="24"/>
+          <w:szCs w:val="24"/>
+        </w:rPr>
+        <w:t xml:space="preserve"> es una empresa dedicada al desarrollo de soluciones tecnológicas para instituciones educativas, por lo que el documento posee un carácter principalmente comercial.</w:t>
       </w:r>
     </w:p>
     <w:p>
@@ -30069,7 +30432,25 @@
           <w:sz w:val="24"/>
           <w:szCs w:val="24"/>
         </w:rPr>
-        <w:t>Sin embargo, debe considerarse que el estudio fue elaborado por la propia empresa desarrolladora de PowerSchool, uno de los principales proveedores de Sistemas de Información</w:t>
+        <w:t xml:space="preserve">Sin embargo, debe considerarse que el estudio fue elaborado por la propia empresa desarrolladora de </w:t>
+      </w:r>
+      <w:proofErr w:type="spellStart"/>
+      <w:r>
+        <w:rPr>
+          <w:rFonts w:asciiTheme="minorHAnsi" w:hAnsiTheme="minorHAnsi" w:cstheme="minorHAnsi"/>
+          <w:sz w:val="24"/>
+          <w:szCs w:val="24"/>
+        </w:rPr>
+        <w:t>PowerSchool</w:t>
+      </w:r>
+      <w:proofErr w:type="spellEnd"/>
+      <w:r>
+        <w:rPr>
+          <w:rFonts w:asciiTheme="minorHAnsi" w:hAnsiTheme="minorHAnsi" w:cstheme="minorHAnsi"/>
+          <w:sz w:val="24"/>
+          <w:szCs w:val="24"/>
+        </w:rPr>
+        <w:t>, uno de los principales proveedores de Sistemas de Información</w:t>
       </w:r>
       <w:r>
         <w:rPr>
@@ -30610,6 +30991,7 @@
         </w:rPr>
         <w:t xml:space="preserve"> </w:t>
       </w:r>
+      <w:proofErr w:type="spellStart"/>
       <w:r>
         <w:rPr>
           <w:rFonts w:asciiTheme="minorHAnsi" w:hAnsiTheme="minorHAnsi" w:cstheme="minorHAnsi"/>
@@ -30619,6 +31001,7 @@
         </w:rPr>
         <w:t>openSIS</w:t>
       </w:r>
+      <w:proofErr w:type="spellEnd"/>
       <w:r>
         <w:rPr>
           <w:rFonts w:asciiTheme="minorHAnsi" w:hAnsiTheme="minorHAnsi" w:cstheme="minorHAnsi"/>
@@ -31154,13 +31537,23 @@
         </w:rPr>
         <w:t xml:space="preserve"> </w:t>
       </w:r>
-      <w:r>
-        <w:rPr>
-          <w:rFonts w:asciiTheme="minorHAnsi" w:hAnsiTheme="minorHAnsi" w:cstheme="minorHAnsi"/>
-          <w:sz w:val="24"/>
-          <w:szCs w:val="24"/>
-        </w:rPr>
-        <w:t>openSIS,</w:t>
+      <w:proofErr w:type="spellStart"/>
+      <w:r>
+        <w:rPr>
+          <w:rFonts w:asciiTheme="minorHAnsi" w:hAnsiTheme="minorHAnsi" w:cstheme="minorHAnsi"/>
+          <w:sz w:val="24"/>
+          <w:szCs w:val="24"/>
+        </w:rPr>
+        <w:t>openSIS</w:t>
+      </w:r>
+      <w:proofErr w:type="spellEnd"/>
+      <w:r>
+        <w:rPr>
+          <w:rFonts w:asciiTheme="minorHAnsi" w:hAnsiTheme="minorHAnsi" w:cstheme="minorHAnsi"/>
+          <w:sz w:val="24"/>
+          <w:szCs w:val="24"/>
+        </w:rPr>
+        <w:t>,</w:t>
       </w:r>
       <w:r>
         <w:rPr>
@@ -31496,17 +31889,7 @@
           <w:sz w:val="24"/>
           <w:szCs w:val="24"/>
         </w:rPr>
-        <w:t xml:space="preserve">REFERENCIAS </w:t>
-      </w:r>
-      <w:r>
-        <w:rPr>
-          <w:rFonts w:asciiTheme="minorHAnsi" w:hAnsiTheme="minorHAnsi" w:cstheme="minorHAnsi"/>
-          <w:b/>
-          <w:bCs/>
-          <w:sz w:val="24"/>
-          <w:szCs w:val="24"/>
-        </w:rPr>
-        <w:t>ELIMINADAS</w:t>
+        <w:t>REFERENCIAS ELIMINADAS</w:t>
       </w:r>
     </w:p>
     <w:p>
@@ -32659,27 +33042,7 @@
           <w:szCs w:val="24"/>
           <w:lang w:val="en-US"/>
         </w:rPr>
-        <w:t>Education Management Information System (EMIS) and Its Implications to</w:t>
-      </w:r>
-      <w:r>
-        <w:rPr>
-          <w:rFonts w:asciiTheme="minorHAnsi" w:hAnsiTheme="minorHAnsi" w:cstheme="minorHAnsi"/>
-          <w:color w:val="EE0000"/>
-          <w:sz w:val="24"/>
-          <w:szCs w:val="24"/>
-          <w:lang w:val="en-US"/>
-        </w:rPr>
-        <w:t xml:space="preserve"> </w:t>
-      </w:r>
-      <w:r>
-        <w:rPr>
-          <w:rFonts w:asciiTheme="minorHAnsi" w:hAnsiTheme="minorHAnsi" w:cstheme="minorHAnsi"/>
-          <w:color w:val="EE0000"/>
-          <w:sz w:val="24"/>
-          <w:szCs w:val="24"/>
-          <w:lang w:val="en-US"/>
-        </w:rPr>
-        <w:t>Educational Policy: A Mini-Review.</w:t>
+        <w:t>Education Management Information System (EMIS) and Its Implications to Educational Policy: A Mini-Review.</w:t>
       </w:r>
     </w:p>
     <w:p>
@@ -33449,25 +33812,7 @@
           <w:sz w:val="24"/>
           <w:szCs w:val="24"/>
         </w:rPr>
-        <w:t>SCORM dentro de plataformas de aprendizaje virtual, evaluando su efecto sobre el rendimiento académico de estudiantes universitarios. Aunque se trata de un estudio reconocido dentro del</w:t>
-      </w:r>
-      <w:r>
-        <w:rPr>
-          <w:rFonts w:asciiTheme="minorHAnsi" w:hAnsiTheme="minorHAnsi" w:cstheme="minorHAnsi"/>
-          <w:color w:val="EE0000"/>
-          <w:sz w:val="24"/>
-          <w:szCs w:val="24"/>
-        </w:rPr>
-        <w:t xml:space="preserve"> </w:t>
-      </w:r>
-      <w:r>
-        <w:rPr>
-          <w:rFonts w:asciiTheme="minorHAnsi" w:hAnsiTheme="minorHAnsi" w:cstheme="minorHAnsi"/>
-          <w:color w:val="EE0000"/>
-          <w:sz w:val="24"/>
-          <w:szCs w:val="24"/>
-        </w:rPr>
-        <w:t>campo</w:t>
+        <w:t>SCORM dentro de plataformas de aprendizaje virtual, evaluando su efecto sobre el rendimiento académico de estudiantes universitarios. Aunque se trata de un estudio reconocido dentro del campo</w:t>
       </w:r>
       <w:r>
         <w:rPr>
@@ -34159,7 +34504,27 @@
           <w:sz w:val="24"/>
           <w:szCs w:val="24"/>
         </w:rPr>
-        <w:t>con Sistemas de Información Académicos o School Management Systems.</w:t>
+        <w:t xml:space="preserve">con Sistemas de Información Académicos o School Management </w:t>
+      </w:r>
+      <w:proofErr w:type="spellStart"/>
+      <w:r>
+        <w:rPr>
+          <w:rFonts w:asciiTheme="minorHAnsi" w:hAnsiTheme="minorHAnsi" w:cstheme="minorHAnsi"/>
+          <w:color w:val="EE0000"/>
+          <w:sz w:val="24"/>
+          <w:szCs w:val="24"/>
+        </w:rPr>
+        <w:t>Systems</w:t>
+      </w:r>
+      <w:proofErr w:type="spellEnd"/>
+      <w:r>
+        <w:rPr>
+          <w:rFonts w:asciiTheme="minorHAnsi" w:hAnsiTheme="minorHAnsi" w:cstheme="minorHAnsi"/>
+          <w:color w:val="EE0000"/>
+          <w:sz w:val="24"/>
+          <w:szCs w:val="24"/>
+        </w:rPr>
+        <w:t>.</w:t>
       </w:r>
     </w:p>
     <w:p>
@@ -34201,9 +34566,19 @@
           <w:color w:val="EE0000"/>
           <w:sz w:val="24"/>
           <w:szCs w:val="24"/>
-          <w:lang w:val="en-US"/>
-        </w:rPr>
-        <w:t xml:space="preserve">    CT</w:t>
+          <w:lang w:val="es-CO"/>
+        </w:rPr>
+        <w:t xml:space="preserve">    </w:t>
+      </w:r>
+      <w:r>
+        <w:rPr>
+          <w:rFonts w:asciiTheme="minorHAnsi" w:hAnsiTheme="minorHAnsi" w:cstheme="minorHAnsi"/>
+          <w:color w:val="EE0000"/>
+          <w:sz w:val="24"/>
+          <w:szCs w:val="24"/>
+          <w:lang w:val="en-US"/>
+        </w:rPr>
+        <w:t>CT</w:t>
       </w:r>
       <w:r>
         <w:rPr>
@@ -34540,7 +34915,27 @@
           <w:sz w:val="24"/>
           <w:szCs w:val="24"/>
         </w:rPr>
-        <w:t>Esta referencia documenta un incidente real de seguridad informática relacionado con PowerSchool, uno de los sistemas de información académica más utilizados a nivel internacional.</w:t>
+        <w:t xml:space="preserve">Esta referencia documenta un incidente real de seguridad informática relacionado con </w:t>
+      </w:r>
+      <w:proofErr w:type="spellStart"/>
+      <w:r>
+        <w:rPr>
+          <w:rFonts w:asciiTheme="minorHAnsi" w:hAnsiTheme="minorHAnsi" w:cstheme="minorHAnsi"/>
+          <w:color w:val="EE0000"/>
+          <w:sz w:val="24"/>
+          <w:szCs w:val="24"/>
+        </w:rPr>
+        <w:t>PowerSchool</w:t>
+      </w:r>
+      <w:proofErr w:type="spellEnd"/>
+      <w:r>
+        <w:rPr>
+          <w:rFonts w:asciiTheme="minorHAnsi" w:hAnsiTheme="minorHAnsi" w:cstheme="minorHAnsi"/>
+          <w:color w:val="EE0000"/>
+          <w:sz w:val="24"/>
+          <w:szCs w:val="24"/>
+        </w:rPr>
+        <w:t>, uno de los sistemas de información académica más utilizados a nivel internacional.</w:t>
       </w:r>
       <w:r>
         <w:rPr>
@@ -35314,9 +35709,19 @@
           <w:color w:val="EE0000"/>
           <w:sz w:val="24"/>
           <w:szCs w:val="24"/>
-          <w:lang w:val="en-US"/>
-        </w:rPr>
-        <w:t xml:space="preserve">    Birnbaum,</w:t>
+          <w:lang w:val="es-CO"/>
+        </w:rPr>
+        <w:t xml:space="preserve">    </w:t>
+      </w:r>
+      <w:r>
+        <w:rPr>
+          <w:rFonts w:asciiTheme="minorHAnsi" w:hAnsiTheme="minorHAnsi" w:cstheme="minorHAnsi"/>
+          <w:color w:val="EE0000"/>
+          <w:sz w:val="24"/>
+          <w:szCs w:val="24"/>
+          <w:lang w:val="en-US"/>
+        </w:rPr>
+        <w:t>Birnbaum,</w:t>
       </w:r>
       <w:r>
         <w:rPr>
@@ -36777,7 +37182,27 @@
           <w:sz w:val="24"/>
           <w:szCs w:val="24"/>
         </w:rPr>
-        <w:t>La publicación analiza el uso de la metodología Extreme Programming (XP) como estrategia para</w:t>
+        <w:t xml:space="preserve">La publicación analiza el uso de la metodología Extreme </w:t>
+      </w:r>
+      <w:proofErr w:type="spellStart"/>
+      <w:r>
+        <w:rPr>
+          <w:rFonts w:asciiTheme="minorHAnsi" w:hAnsiTheme="minorHAnsi" w:cstheme="minorHAnsi"/>
+          <w:color w:val="EE0000"/>
+          <w:sz w:val="24"/>
+          <w:szCs w:val="24"/>
+        </w:rPr>
+        <w:t>Programming</w:t>
+      </w:r>
+      <w:proofErr w:type="spellEnd"/>
+      <w:r>
+        <w:rPr>
+          <w:rFonts w:asciiTheme="minorHAnsi" w:hAnsiTheme="minorHAnsi" w:cstheme="minorHAnsi"/>
+          <w:color w:val="EE0000"/>
+          <w:sz w:val="24"/>
+          <w:szCs w:val="24"/>
+        </w:rPr>
+        <w:t xml:space="preserve"> (XP) como estrategia para</w:t>
       </w:r>
       <w:r>
         <w:rPr>
@@ -37779,15 +38204,27 @@
           <w:lang w:val="en-US"/>
         </w:rPr>
       </w:pPr>
-      <w:r>
-        <w:rPr>
-          <w:rFonts w:asciiTheme="minorHAnsi" w:hAnsiTheme="minorHAnsi" w:cstheme="minorHAnsi"/>
-          <w:color w:val="EE0000"/>
-          <w:sz w:val="24"/>
-          <w:szCs w:val="24"/>
-          <w:lang w:val="en-US"/>
-        </w:rPr>
-        <w:t>Kamisli,</w:t>
+      <w:proofErr w:type="spellStart"/>
+      <w:r>
+        <w:rPr>
+          <w:rFonts w:asciiTheme="minorHAnsi" w:hAnsiTheme="minorHAnsi" w:cstheme="minorHAnsi"/>
+          <w:color w:val="EE0000"/>
+          <w:sz w:val="24"/>
+          <w:szCs w:val="24"/>
+          <w:lang w:val="en-US"/>
+        </w:rPr>
+        <w:t>Kamisli</w:t>
+      </w:r>
+      <w:proofErr w:type="spellEnd"/>
+      <w:r>
+        <w:rPr>
+          <w:rFonts w:asciiTheme="minorHAnsi" w:hAnsiTheme="minorHAnsi" w:cstheme="minorHAnsi"/>
+          <w:color w:val="EE0000"/>
+          <w:sz w:val="24"/>
+          <w:szCs w:val="24"/>
+          <w:lang w:val="en-US"/>
+        </w:rPr>
+        <w:t>,</w:t>
       </w:r>
       <w:r>
         <w:rPr>
@@ -40321,25 +40758,7 @@
           <w:sz w:val="24"/>
           <w:szCs w:val="24"/>
         </w:rPr>
-        <w:t>gestores de bases de datos, pero existen trabajos mucho más recientes y específicos que respaldarían mejor las decisiones tecnológicas adoptadas durante el desar</w:t>
-      </w:r>
-      <w:r>
-        <w:rPr>
-          <w:rFonts w:asciiTheme="minorHAnsi" w:hAnsiTheme="minorHAnsi" w:cstheme="minorHAnsi"/>
-          <w:color w:val="EE0000"/>
-          <w:sz w:val="24"/>
-          <w:szCs w:val="24"/>
-        </w:rPr>
-        <w:t>r</w:t>
-      </w:r>
-      <w:r>
-        <w:rPr>
-          <w:rFonts w:asciiTheme="minorHAnsi" w:hAnsiTheme="minorHAnsi" w:cstheme="minorHAnsi"/>
-          <w:color w:val="EE0000"/>
-          <w:sz w:val="24"/>
-          <w:szCs w:val="24"/>
-        </w:rPr>
-        <w:t>ollo del proyecto.</w:t>
+        <w:t>gestores de bases de datos, pero existen trabajos mucho más recientes y específicos que respaldarían mejor las decisiones tecnológicas adoptadas durante el desarrollo del proyecto.</w:t>
       </w:r>
     </w:p>
     <w:p>
@@ -40391,6 +40810,7 @@
           <w:lang w:val="en-US"/>
         </w:rPr>
       </w:pPr>
+      <w:proofErr w:type="spellStart"/>
       <w:r>
         <w:rPr>
           <w:rFonts w:asciiTheme="minorHAnsi" w:hAnsiTheme="minorHAnsi" w:cstheme="minorHAnsi"/>
@@ -40399,7 +40819,17 @@
           <w:szCs w:val="24"/>
         </w:rPr>
         <w:lastRenderedPageBreak/>
-        <w:t>Hentea,</w:t>
+        <w:t>Hentea</w:t>
+      </w:r>
+      <w:proofErr w:type="spellEnd"/>
+      <w:r>
+        <w:rPr>
+          <w:rFonts w:asciiTheme="minorHAnsi" w:hAnsiTheme="minorHAnsi" w:cstheme="minorHAnsi"/>
+          <w:color w:val="EE0000"/>
+          <w:sz w:val="24"/>
+          <w:szCs w:val="24"/>
+        </w:rPr>
+        <w:t>,</w:t>
       </w:r>
       <w:r>
         <w:rPr>
@@ -41897,6 +42327,642 @@
         </w:rPr>
         <w:t>.</w:t>
       </w:r>
+    </w:p>
+    <w:tbl>
+      <w:tblPr>
+        <w:tblStyle w:val="Tablaconcuadrcula"/>
+        <w:tblW w:w="0" w:type="auto"/>
+        <w:tblInd w:w="360" w:type="dxa"/>
+        <w:tblLayout w:type="fixed"/>
+        <w:tblLook w:val="04A0" w:firstRow="1" w:lastRow="0" w:firstColumn="1" w:lastColumn="0" w:noHBand="0" w:noVBand="1"/>
+      </w:tblPr>
+      <w:tblGrid>
+        <w:gridCol w:w="2725"/>
+        <w:gridCol w:w="3260"/>
+        <w:gridCol w:w="2709"/>
+      </w:tblGrid>
+      <w:tr>
+        <w:tc>
+          <w:tcPr>
+            <w:tcW w:w="2725" w:type="dxa"/>
+          </w:tcPr>
+          <w:p>
+            <w:pPr>
+              <w:pStyle w:val="Textoindependiente"/>
+              <w:spacing w:line="276" w:lineRule="auto"/>
+              <w:ind w:left="0" w:right="93"/>
+              <w:jc w:val="center"/>
+              <w:rPr>
+                <w:rFonts w:asciiTheme="minorHAnsi" w:hAnsiTheme="minorHAnsi" w:cstheme="minorHAnsi"/>
+                <w:sz w:val="20"/>
+                <w:szCs w:val="20"/>
+              </w:rPr>
+            </w:pPr>
+            <w:r>
+              <w:rPr>
+                <w:rFonts w:asciiTheme="minorHAnsi" w:hAnsiTheme="minorHAnsi" w:cstheme="minorHAnsi"/>
+                <w:sz w:val="20"/>
+                <w:szCs w:val="20"/>
+              </w:rPr>
+              <w:t>Referencia</w:t>
+            </w:r>
+          </w:p>
+        </w:tc>
+        <w:tc>
+          <w:tcPr>
+            <w:tcW w:w="3260" w:type="dxa"/>
+          </w:tcPr>
+          <w:p>
+            <w:pPr>
+              <w:pStyle w:val="Textoindependiente"/>
+              <w:spacing w:line="276" w:lineRule="auto"/>
+              <w:ind w:left="0" w:right="93"/>
+              <w:jc w:val="center"/>
+              <w:rPr>
+                <w:rFonts w:asciiTheme="minorHAnsi" w:hAnsiTheme="minorHAnsi" w:cstheme="minorHAnsi"/>
+                <w:sz w:val="20"/>
+                <w:szCs w:val="20"/>
+              </w:rPr>
+            </w:pPr>
+            <w:r>
+              <w:rPr>
+                <w:rFonts w:asciiTheme="minorHAnsi" w:hAnsiTheme="minorHAnsi" w:cstheme="minorHAnsi"/>
+                <w:sz w:val="20"/>
+                <w:szCs w:val="20"/>
+              </w:rPr>
+              <w:t>¿De qué trata?</w:t>
+            </w:r>
+          </w:p>
+        </w:tc>
+        <w:tc>
+          <w:tcPr>
+            <w:tcW w:w="2709" w:type="dxa"/>
+          </w:tcPr>
+          <w:p>
+            <w:pPr>
+              <w:pStyle w:val="Textoindependiente"/>
+              <w:spacing w:line="276" w:lineRule="auto"/>
+              <w:ind w:left="0" w:right="93"/>
+              <w:jc w:val="center"/>
+              <w:rPr>
+                <w:rFonts w:asciiTheme="minorHAnsi" w:hAnsiTheme="minorHAnsi" w:cstheme="minorHAnsi"/>
+                <w:sz w:val="20"/>
+                <w:szCs w:val="20"/>
+              </w:rPr>
+            </w:pPr>
+            <w:r>
+              <w:rPr>
+                <w:rFonts w:asciiTheme="minorHAnsi" w:hAnsiTheme="minorHAnsi" w:cstheme="minorHAnsi"/>
+                <w:sz w:val="20"/>
+                <w:szCs w:val="20"/>
+              </w:rPr>
+              <w:t>¿Cómo utilizarla en LITARO?</w:t>
+            </w:r>
+          </w:p>
+        </w:tc>
+      </w:tr>
+      <w:tr>
+        <w:tc>
+          <w:tcPr>
+            <w:tcW w:w="2725" w:type="dxa"/>
+          </w:tcPr>
+          <w:p>
+            <w:pPr>
+              <w:pStyle w:val="Textoindependiente"/>
+              <w:spacing w:line="276" w:lineRule="auto"/>
+              <w:ind w:left="0" w:right="93"/>
+              <w:jc w:val="center"/>
+              <w:rPr>
+                <w:rFonts w:asciiTheme="minorHAnsi" w:hAnsiTheme="minorHAnsi" w:cstheme="minorHAnsi"/>
+                <w:sz w:val="20"/>
+                <w:szCs w:val="20"/>
+              </w:rPr>
+            </w:pPr>
+            <w:r>
+              <w:rPr>
+                <w:rFonts w:asciiTheme="minorHAnsi" w:hAnsiTheme="minorHAnsi" w:cstheme="minorHAnsi"/>
+                <w:sz w:val="20"/>
+                <w:szCs w:val="20"/>
+              </w:rPr>
+              <w:t>https://www.sciencedirect.com/science/article/abs/pii/S1383762106000671</w:t>
+            </w:r>
+          </w:p>
+        </w:tc>
+        <w:tc>
+          <w:tcPr>
+            <w:tcW w:w="3260" w:type="dxa"/>
+          </w:tcPr>
+          <w:p>
+            <w:pPr>
+              <w:pStyle w:val="Textoindependiente"/>
+              <w:spacing w:line="276" w:lineRule="auto"/>
+              <w:ind w:left="0" w:right="93"/>
+              <w:jc w:val="center"/>
+              <w:rPr>
+                <w:rFonts w:asciiTheme="minorHAnsi" w:hAnsiTheme="minorHAnsi" w:cstheme="minorHAnsi"/>
+                <w:sz w:val="20"/>
+                <w:szCs w:val="20"/>
+              </w:rPr>
+            </w:pPr>
+            <w:r>
+              <w:rPr>
+                <w:rFonts w:asciiTheme="minorHAnsi" w:hAnsiTheme="minorHAnsi" w:cstheme="minorHAnsi"/>
+                <w:sz w:val="20"/>
+                <w:szCs w:val="20"/>
+              </w:rPr>
+              <w:t xml:space="preserve">Presenta un estudio de caso industrial sobre la adopción de prácticas de Extreme </w:t>
+            </w:r>
+            <w:proofErr w:type="spellStart"/>
+            <w:r>
+              <w:rPr>
+                <w:rFonts w:asciiTheme="minorHAnsi" w:hAnsiTheme="minorHAnsi" w:cstheme="minorHAnsi"/>
+                <w:sz w:val="20"/>
+                <w:szCs w:val="20"/>
+              </w:rPr>
+              <w:t>Programming</w:t>
+            </w:r>
+            <w:proofErr w:type="spellEnd"/>
+            <w:r>
+              <w:rPr>
+                <w:rFonts w:asciiTheme="minorHAnsi" w:hAnsiTheme="minorHAnsi" w:cstheme="minorHAnsi"/>
+                <w:sz w:val="20"/>
+                <w:szCs w:val="20"/>
+              </w:rPr>
+              <w:t xml:space="preserve"> (XP) en Sabre </w:t>
+            </w:r>
+            <w:proofErr w:type="spellStart"/>
+            <w:r>
+              <w:rPr>
+                <w:rFonts w:asciiTheme="minorHAnsi" w:hAnsiTheme="minorHAnsi" w:cstheme="minorHAnsi"/>
+                <w:sz w:val="20"/>
+                <w:szCs w:val="20"/>
+              </w:rPr>
+              <w:t>Airline</w:t>
+            </w:r>
+            <w:proofErr w:type="spellEnd"/>
+            <w:r>
+              <w:rPr>
+                <w:rFonts w:asciiTheme="minorHAnsi" w:hAnsiTheme="minorHAnsi" w:cstheme="minorHAnsi"/>
+                <w:sz w:val="20"/>
+                <w:szCs w:val="20"/>
+              </w:rPr>
+              <w:t xml:space="preserve"> </w:t>
+            </w:r>
+            <w:proofErr w:type="spellStart"/>
+            <w:r>
+              <w:rPr>
+                <w:rFonts w:asciiTheme="minorHAnsi" w:hAnsiTheme="minorHAnsi" w:cstheme="minorHAnsi"/>
+                <w:sz w:val="20"/>
+                <w:szCs w:val="20"/>
+              </w:rPr>
+              <w:t>Solutions</w:t>
+            </w:r>
+            <w:proofErr w:type="spellEnd"/>
+            <w:r>
+              <w:rPr>
+                <w:rFonts w:asciiTheme="minorHAnsi" w:hAnsiTheme="minorHAnsi" w:cstheme="minorHAnsi"/>
+                <w:sz w:val="20"/>
+                <w:szCs w:val="20"/>
+              </w:rPr>
+              <w:t>. El equipo obtuvo resultados de calidad posteriores a la liberación por encima del promedio y productividad entre promedio y superior al promedio</w:t>
+            </w:r>
+          </w:p>
+        </w:tc>
+        <w:tc>
+          <w:tcPr>
+            <w:tcW w:w="2709" w:type="dxa"/>
+          </w:tcPr>
+          <w:p>
+            <w:pPr>
+              <w:pStyle w:val="Textoindependiente"/>
+              <w:spacing w:line="276" w:lineRule="auto"/>
+              <w:ind w:left="0" w:right="93"/>
+              <w:jc w:val="center"/>
+              <w:rPr>
+                <w:rFonts w:asciiTheme="minorHAnsi" w:hAnsiTheme="minorHAnsi" w:cstheme="minorHAnsi"/>
+                <w:sz w:val="20"/>
+                <w:szCs w:val="20"/>
+              </w:rPr>
+            </w:pPr>
+            <w:r>
+              <w:rPr>
+                <w:rFonts w:asciiTheme="minorHAnsi" w:hAnsiTheme="minorHAnsi" w:cstheme="minorHAnsi"/>
+                <w:sz w:val="20"/>
+                <w:szCs w:val="20"/>
+              </w:rPr>
+              <w:t>Es probablemente la mejor referencia para justificar XP. Puedes utilizarla para argumentar que XP ha sido estudiada en contextos reales y que sus prácticas pueden contribuir a la calidad y productividad.</w:t>
+            </w:r>
+          </w:p>
+        </w:tc>
+      </w:tr>
+      <w:tr>
+        <w:tc>
+          <w:tcPr>
+            <w:tcW w:w="2725" w:type="dxa"/>
+          </w:tcPr>
+          <w:p>
+            <w:pPr>
+              <w:pStyle w:val="Textoindependiente"/>
+              <w:spacing w:line="276" w:lineRule="auto"/>
+              <w:ind w:left="0" w:right="93"/>
+              <w:jc w:val="center"/>
+              <w:rPr>
+                <w:rFonts w:asciiTheme="minorHAnsi" w:hAnsiTheme="minorHAnsi" w:cstheme="minorHAnsi"/>
+                <w:sz w:val="20"/>
+                <w:szCs w:val="20"/>
+              </w:rPr>
+            </w:pPr>
+            <w:r>
+              <w:rPr>
+                <w:rFonts w:asciiTheme="minorHAnsi" w:hAnsiTheme="minorHAnsi" w:cstheme="minorHAnsi"/>
+                <w:sz w:val="20"/>
+                <w:szCs w:val="20"/>
+              </w:rPr>
+              <w:t>https://www.researchgate.net/publication/266024161_Q</w:t>
+            </w:r>
+            <w:r>
+              <w:rPr>
+                <w:rFonts w:asciiTheme="minorHAnsi" w:hAnsiTheme="minorHAnsi" w:cstheme="minorHAnsi"/>
+                <w:sz w:val="20"/>
+                <w:szCs w:val="20"/>
+              </w:rPr>
+              <w:lastRenderedPageBreak/>
+              <w:t>uantitative_Survey_on_Extreme_Programming_Project</w:t>
+            </w:r>
+          </w:p>
+        </w:tc>
+        <w:tc>
+          <w:tcPr>
+            <w:tcW w:w="3260" w:type="dxa"/>
+          </w:tcPr>
+          <w:p>
+            <w:pPr>
+              <w:pStyle w:val="Textoindependiente"/>
+              <w:spacing w:line="276" w:lineRule="auto"/>
+              <w:ind w:left="0" w:right="93"/>
+              <w:jc w:val="center"/>
+              <w:rPr>
+                <w:rFonts w:asciiTheme="minorHAnsi" w:hAnsiTheme="minorHAnsi" w:cstheme="minorHAnsi"/>
+                <w:sz w:val="20"/>
+                <w:szCs w:val="20"/>
+              </w:rPr>
+            </w:pPr>
+            <w:r>
+              <w:rPr>
+                <w:rFonts w:asciiTheme="minorHAnsi" w:hAnsiTheme="minorHAnsi" w:cstheme="minorHAnsi"/>
+                <w:sz w:val="20"/>
+                <w:szCs w:val="20"/>
+              </w:rPr>
+              <w:lastRenderedPageBreak/>
+              <w:t xml:space="preserve">Estudia XP desde una perspectiva cuantitativa, analizando proyectos </w:t>
+            </w:r>
+            <w:r>
+              <w:rPr>
+                <w:rFonts w:asciiTheme="minorHAnsi" w:hAnsiTheme="minorHAnsi" w:cstheme="minorHAnsi"/>
+                <w:sz w:val="20"/>
+                <w:szCs w:val="20"/>
+              </w:rPr>
+              <w:lastRenderedPageBreak/>
+              <w:t>que utilizan prácticas de la metodología.</w:t>
+            </w:r>
+          </w:p>
+        </w:tc>
+        <w:tc>
+          <w:tcPr>
+            <w:tcW w:w="2709" w:type="dxa"/>
+          </w:tcPr>
+          <w:p>
+            <w:pPr>
+              <w:pStyle w:val="Textoindependiente"/>
+              <w:spacing w:line="276" w:lineRule="auto"/>
+              <w:ind w:left="0" w:right="93"/>
+              <w:jc w:val="center"/>
+              <w:rPr>
+                <w:rFonts w:asciiTheme="minorHAnsi" w:hAnsiTheme="minorHAnsi" w:cstheme="minorHAnsi"/>
+                <w:sz w:val="20"/>
+                <w:szCs w:val="20"/>
+              </w:rPr>
+            </w:pPr>
+            <w:r>
+              <w:rPr>
+                <w:rFonts w:asciiTheme="minorHAnsi" w:hAnsiTheme="minorHAnsi" w:cstheme="minorHAnsi"/>
+                <w:sz w:val="20"/>
+                <w:szCs w:val="20"/>
+              </w:rPr>
+              <w:lastRenderedPageBreak/>
+              <w:t xml:space="preserve">Te sirve para respaldar que la elección de XP no se basa </w:t>
+            </w:r>
+            <w:r>
+              <w:rPr>
+                <w:rFonts w:asciiTheme="minorHAnsi" w:hAnsiTheme="minorHAnsi" w:cstheme="minorHAnsi"/>
+                <w:sz w:val="20"/>
+                <w:szCs w:val="20"/>
+              </w:rPr>
+              <w:lastRenderedPageBreak/>
+              <w:t>únicamente en una preferencia metodológica, sino que existen estudios cuantitativos sobre su aplicación.</w:t>
+            </w:r>
+          </w:p>
+        </w:tc>
+      </w:tr>
+      <w:tr>
+        <w:tc>
+          <w:tcPr>
+            <w:tcW w:w="2725" w:type="dxa"/>
+          </w:tcPr>
+          <w:p>
+            <w:pPr>
+              <w:pStyle w:val="Textoindependiente"/>
+              <w:spacing w:line="276" w:lineRule="auto"/>
+              <w:ind w:left="0" w:right="93"/>
+              <w:jc w:val="center"/>
+              <w:rPr>
+                <w:rFonts w:asciiTheme="minorHAnsi" w:hAnsiTheme="minorHAnsi" w:cstheme="minorHAnsi"/>
+                <w:sz w:val="20"/>
+                <w:szCs w:val="20"/>
+              </w:rPr>
+            </w:pPr>
+            <w:r>
+              <w:rPr>
+                <w:rFonts w:asciiTheme="minorHAnsi" w:hAnsiTheme="minorHAnsi" w:cstheme="minorHAnsi"/>
+                <w:sz w:val="20"/>
+                <w:szCs w:val="20"/>
+              </w:rPr>
+              <w:t>https://www.sciencedirect.com/science/article/pii/S0164121223002674</w:t>
+            </w:r>
+          </w:p>
+        </w:tc>
+        <w:tc>
+          <w:tcPr>
+            <w:tcW w:w="3260" w:type="dxa"/>
+          </w:tcPr>
+          <w:p>
+            <w:pPr>
+              <w:pStyle w:val="Textoindependiente"/>
+              <w:spacing w:line="276" w:lineRule="auto"/>
+              <w:ind w:left="0" w:right="93"/>
+              <w:jc w:val="center"/>
+              <w:rPr>
+                <w:rFonts w:asciiTheme="minorHAnsi" w:hAnsiTheme="minorHAnsi" w:cstheme="minorHAnsi"/>
+                <w:sz w:val="20"/>
+                <w:szCs w:val="20"/>
+              </w:rPr>
+            </w:pPr>
+            <w:r>
+              <w:rPr>
+                <w:rFonts w:asciiTheme="minorHAnsi" w:hAnsiTheme="minorHAnsi" w:cstheme="minorHAnsi"/>
+                <w:sz w:val="20"/>
+                <w:szCs w:val="20"/>
+              </w:rPr>
+              <w:t xml:space="preserve">Revisión sistemática de investigaciones que comparan el rendimiento de diferentes sistemas gestores de bases de datos. Los autores advierten que muchos </w:t>
+            </w:r>
+            <w:proofErr w:type="spellStart"/>
+            <w:r>
+              <w:rPr>
+                <w:rFonts w:asciiTheme="minorHAnsi" w:hAnsiTheme="minorHAnsi" w:cstheme="minorHAnsi"/>
+                <w:sz w:val="20"/>
+                <w:szCs w:val="20"/>
+              </w:rPr>
+              <w:t>benchmarks</w:t>
+            </w:r>
+            <w:proofErr w:type="spellEnd"/>
+            <w:r>
+              <w:rPr>
+                <w:rFonts w:asciiTheme="minorHAnsi" w:hAnsiTheme="minorHAnsi" w:cstheme="minorHAnsi"/>
+                <w:sz w:val="20"/>
+                <w:szCs w:val="20"/>
+              </w:rPr>
+              <w:t xml:space="preserve"> no representan adecuadamente escenarios reales, por lo que las comparaciones deben interpretarse cuidadosamente.</w:t>
+            </w:r>
+          </w:p>
+        </w:tc>
+        <w:tc>
+          <w:tcPr>
+            <w:tcW w:w="2709" w:type="dxa"/>
+          </w:tcPr>
+          <w:p>
+            <w:pPr>
+              <w:pStyle w:val="Textoindependiente"/>
+              <w:spacing w:line="276" w:lineRule="auto"/>
+              <w:ind w:left="0" w:right="93"/>
+              <w:jc w:val="center"/>
+              <w:rPr>
+                <w:rFonts w:asciiTheme="minorHAnsi" w:hAnsiTheme="minorHAnsi" w:cstheme="minorHAnsi"/>
+                <w:sz w:val="20"/>
+                <w:szCs w:val="20"/>
+              </w:rPr>
+            </w:pPr>
+            <w:r>
+              <w:rPr>
+                <w:rFonts w:asciiTheme="minorHAnsi" w:hAnsiTheme="minorHAnsi" w:cstheme="minorHAnsi"/>
+                <w:sz w:val="20"/>
+                <w:szCs w:val="20"/>
+              </w:rPr>
+              <w:t>Es excelente para tu marco de decisión tecnológica. Te permite evitar afirmar que PostgreSQL es universalmente “más rápido” y justificar que la selección debe responder a los requerimientos concretos de LITARO.</w:t>
+            </w:r>
+          </w:p>
+        </w:tc>
+      </w:tr>
+      <w:tr>
+        <w:tc>
+          <w:tcPr>
+            <w:tcW w:w="2725" w:type="dxa"/>
+          </w:tcPr>
+          <w:p>
+            <w:pPr>
+              <w:pStyle w:val="Textoindependiente"/>
+              <w:spacing w:line="276" w:lineRule="auto"/>
+              <w:ind w:left="0" w:right="93"/>
+              <w:jc w:val="center"/>
+              <w:rPr>
+                <w:rFonts w:asciiTheme="minorHAnsi" w:hAnsiTheme="minorHAnsi" w:cstheme="minorHAnsi"/>
+                <w:sz w:val="20"/>
+                <w:szCs w:val="20"/>
+              </w:rPr>
+            </w:pPr>
+            <w:r>
+              <w:rPr>
+                <w:rFonts w:asciiTheme="minorHAnsi" w:hAnsiTheme="minorHAnsi" w:cstheme="minorHAnsi"/>
+                <w:sz w:val="20"/>
+                <w:szCs w:val="20"/>
+              </w:rPr>
+              <w:t>https://www.postgresql.org/about/</w:t>
+            </w:r>
+          </w:p>
+        </w:tc>
+        <w:tc>
+          <w:tcPr>
+            <w:tcW w:w="3260" w:type="dxa"/>
+          </w:tcPr>
+          <w:p>
+            <w:pPr>
+              <w:pStyle w:val="Textoindependiente"/>
+              <w:spacing w:line="276" w:lineRule="auto"/>
+              <w:ind w:left="0" w:right="93"/>
+              <w:jc w:val="center"/>
+              <w:rPr>
+                <w:rFonts w:asciiTheme="minorHAnsi" w:hAnsiTheme="minorHAnsi" w:cstheme="minorHAnsi"/>
+                <w:sz w:val="20"/>
+                <w:szCs w:val="20"/>
+              </w:rPr>
+            </w:pPr>
+            <w:r>
+              <w:rPr>
+                <w:rFonts w:asciiTheme="minorHAnsi" w:hAnsiTheme="minorHAnsi" w:cstheme="minorHAnsi"/>
+                <w:sz w:val="20"/>
+                <w:szCs w:val="20"/>
+              </w:rPr>
+              <w:t>Documentación oficial que describe PostgreSQL como un sistema objeto-relacional de código abierto, destacando arquitectura, confiabilidad, integridad de datos, extensibilidad, ACID, MVCC, particionamiento, seguridad y otros mecanismos.</w:t>
+            </w:r>
+          </w:p>
+        </w:tc>
+        <w:tc>
+          <w:tcPr>
+            <w:tcW w:w="2709" w:type="dxa"/>
+          </w:tcPr>
+          <w:p>
+            <w:pPr>
+              <w:pStyle w:val="Textoindependiente"/>
+              <w:spacing w:line="276" w:lineRule="auto"/>
+              <w:ind w:left="0" w:right="93"/>
+              <w:jc w:val="center"/>
+              <w:rPr>
+                <w:rFonts w:asciiTheme="minorHAnsi" w:hAnsiTheme="minorHAnsi" w:cstheme="minorHAnsi"/>
+                <w:sz w:val="20"/>
+                <w:szCs w:val="20"/>
+              </w:rPr>
+            </w:pPr>
+            <w:r>
+              <w:rPr>
+                <w:rFonts w:asciiTheme="minorHAnsi" w:hAnsiTheme="minorHAnsi" w:cstheme="minorHAnsi"/>
+                <w:sz w:val="20"/>
+                <w:szCs w:val="20"/>
+              </w:rPr>
+              <w:t>Es la referencia principal para justificar por qué PostgreSQL técnicamente satisface las necesidades de LITARO: relaciones entre estudiantes, cursos, matrículas, docentes, evaluaciones, usuarios, etc.</w:t>
+            </w:r>
+          </w:p>
+        </w:tc>
+      </w:tr>
+      <w:tr>
+        <w:tc>
+          <w:tcPr>
+            <w:tcW w:w="2725" w:type="dxa"/>
+          </w:tcPr>
+          <w:p>
+            <w:pPr>
+              <w:pStyle w:val="Textoindependiente"/>
+              <w:spacing w:line="276" w:lineRule="auto"/>
+              <w:ind w:left="0" w:right="93"/>
+              <w:jc w:val="center"/>
+              <w:rPr>
+                <w:rFonts w:asciiTheme="minorHAnsi" w:hAnsiTheme="minorHAnsi" w:cstheme="minorHAnsi"/>
+                <w:sz w:val="20"/>
+                <w:szCs w:val="20"/>
+              </w:rPr>
+            </w:pPr>
+            <w:r>
+              <w:rPr>
+                <w:rFonts w:asciiTheme="minorHAnsi" w:hAnsiTheme="minorHAnsi" w:cstheme="minorHAnsi"/>
+                <w:sz w:val="20"/>
+                <w:szCs w:val="20"/>
+              </w:rPr>
+              <w:t>https://www.postgresql.org/docs/current/wal.html</w:t>
+            </w:r>
+          </w:p>
+          <w:p>
+            <w:pPr>
+              <w:pStyle w:val="Textoindependiente"/>
+              <w:spacing w:line="276" w:lineRule="auto"/>
+              <w:ind w:left="0" w:right="93"/>
+              <w:jc w:val="center"/>
+              <w:rPr>
+                <w:rFonts w:asciiTheme="minorHAnsi" w:hAnsiTheme="minorHAnsi" w:cstheme="minorHAnsi"/>
+                <w:sz w:val="20"/>
+                <w:szCs w:val="20"/>
+                <w:lang w:val="en-US"/>
+              </w:rPr>
+            </w:pPr>
+            <w:r>
+              <w:rPr>
+                <w:rFonts w:asciiTheme="minorHAnsi" w:hAnsiTheme="minorHAnsi" w:cstheme="minorHAnsi"/>
+                <w:sz w:val="20"/>
+                <w:szCs w:val="20"/>
+                <w:lang w:val="en-US"/>
+              </w:rPr>
+              <w:t>Chapter 28. Reliability and the Write-Ahead Log</w:t>
+            </w:r>
+          </w:p>
+        </w:tc>
+        <w:tc>
+          <w:tcPr>
+            <w:tcW w:w="3260" w:type="dxa"/>
+          </w:tcPr>
+          <w:p>
+            <w:pPr>
+              <w:pStyle w:val="Textoindependiente"/>
+              <w:spacing w:line="276" w:lineRule="auto"/>
+              <w:ind w:left="0" w:right="93"/>
+              <w:jc w:val="center"/>
+              <w:rPr>
+                <w:rFonts w:asciiTheme="minorHAnsi" w:hAnsiTheme="minorHAnsi" w:cstheme="minorHAnsi"/>
+                <w:sz w:val="20"/>
+                <w:szCs w:val="20"/>
+                <w:lang w:val="es-CO"/>
+              </w:rPr>
+            </w:pPr>
+            <w:r>
+              <w:rPr>
+                <w:rFonts w:asciiTheme="minorHAnsi" w:hAnsiTheme="minorHAnsi" w:cstheme="minorHAnsi"/>
+                <w:sz w:val="20"/>
+                <w:szCs w:val="20"/>
+                <w:lang w:val="es-CO"/>
+              </w:rPr>
+              <w:t>Explica los mecanismos mediante los cuales PostgreSQL busca garantizar que las transacciones confirmadas permanezcan almacenadas de forma segura, incluso ante determinados fallos del sistema.</w:t>
+            </w:r>
+          </w:p>
+        </w:tc>
+        <w:tc>
+          <w:tcPr>
+            <w:tcW w:w="2709" w:type="dxa"/>
+          </w:tcPr>
+          <w:p>
+            <w:pPr>
+              <w:pStyle w:val="Textoindependiente"/>
+              <w:spacing w:line="276" w:lineRule="auto"/>
+              <w:ind w:left="0" w:right="93"/>
+              <w:jc w:val="center"/>
+              <w:rPr>
+                <w:rFonts w:asciiTheme="minorHAnsi" w:hAnsiTheme="minorHAnsi" w:cstheme="minorHAnsi"/>
+                <w:sz w:val="20"/>
+                <w:szCs w:val="20"/>
+                <w:lang w:val="es-CO"/>
+              </w:rPr>
+            </w:pPr>
+            <w:r>
+              <w:rPr>
+                <w:rFonts w:asciiTheme="minorHAnsi" w:hAnsiTheme="minorHAnsi" w:cstheme="minorHAnsi"/>
+                <w:sz w:val="20"/>
+                <w:szCs w:val="20"/>
+                <w:lang w:val="es-CO"/>
+              </w:rPr>
+              <w:t>Muy buena para justificar confiabilidad e integridad de información académica. Por ejemplo, puedes relacionarla con matrículas, calificaciones y registros de estudiantes, donde perder o corromper información sería crítico.</w:t>
+            </w:r>
+          </w:p>
+        </w:tc>
+      </w:tr>
+    </w:tbl>
+    <w:p>
+      <w:pPr>
+        <w:pStyle w:val="Textoindependiente"/>
+        <w:spacing w:line="276" w:lineRule="auto"/>
+        <w:ind w:right="93"/>
+        <w:jc w:val="center"/>
+        <w:rPr>
+          <w:rFonts w:asciiTheme="minorHAnsi" w:hAnsiTheme="minorHAnsi" w:cstheme="minorHAnsi"/>
+          <w:sz w:val="24"/>
+          <w:szCs w:val="24"/>
+          <w:lang w:val="es-CO"/>
+        </w:rPr>
+      </w:pPr>
     </w:p>
     <w:sectPr>
       <w:pgSz w:w="12240" w:h="15840"/>
@@ -42790,7 +43856,6 @@
   <w:style w:type="character" w:default="1" w:styleId="Fuentedeprrafopredeter">
     <w:name w:val="Default Paragraph Font"/>
     <w:uiPriority w:val="1"/>
-    <w:semiHidden/>
     <w:unhideWhenUsed/>
   </w:style>
   <w:style w:type="table" w:default="1" w:styleId="Tablanormal">
@@ -42872,6 +43937,45 @@
     <w:rPr>
       <w:rFonts w:ascii="Arial MT" w:eastAsia="Arial MT" w:hAnsi="Arial MT" w:cs="Arial MT"/>
       <w:lang w:val="es-ES"/>
+    </w:rPr>
+  </w:style>
+  <w:style w:type="table" w:styleId="Tablaconcuadrcula">
+    <w:name w:val="Table Grid"/>
+    <w:basedOn w:val="Tablanormal"/>
+    <w:uiPriority w:val="39"/>
+    <w:rsid w:val="00A75172"/>
+    <w:tblPr>
+      <w:tblBorders>
+        <w:top w:val="single" w:sz="4" w:space="0" w:color="auto"/>
+        <w:left w:val="single" w:sz="4" w:space="0" w:color="auto"/>
+        <w:bottom w:val="single" w:sz="4" w:space="0" w:color="auto"/>
+        <w:right w:val="single" w:sz="4" w:space="0" w:color="auto"/>
+        <w:insideH w:val="single" w:sz="4" w:space="0" w:color="auto"/>
+        <w:insideV w:val="single" w:sz="4" w:space="0" w:color="auto"/>
+      </w:tblBorders>
+    </w:tblPr>
+  </w:style>
+  <w:style w:type="character" w:styleId="Hipervnculo">
+    <w:name w:val="Hyperlink"/>
+    <w:basedOn w:val="Fuentedeprrafopredeter"/>
+    <w:uiPriority w:val="99"/>
+    <w:unhideWhenUsed/>
+    <w:rsid w:val="00B1025A"/>
+    <w:rPr>
+      <w:color w:val="0000FF" w:themeColor="hyperlink"/>
+      <w:u w:val="single"/>
+    </w:rPr>
+  </w:style>
+  <w:style w:type="character" w:styleId="Mencinsinresolver">
+    <w:name w:val="Unresolved Mention"/>
+    <w:basedOn w:val="Fuentedeprrafopredeter"/>
+    <w:uiPriority w:val="99"/>
+    <w:semiHidden/>
+    <w:unhideWhenUsed/>
+    <w:rsid w:val="00B1025A"/>
+    <w:rPr>
+      <w:color w:val="605E5C"/>
+      <w:shd w:val="clear" w:color="auto" w:fill="E1DFDD"/>
     </w:rPr>
   </w:style>
 </w:styles>

</xml_diff>

<commit_message>
Ajuste de referencias y contenido
</commit_message>
<xml_diff>
--- a/docs/DocumentoUniversidad/references/Analisis de referencias.docx
+++ b/docs/DocumentoUniversidad/references/Analisis de referencias.docx
@@ -1,6 +1,6 @@
 
 <file path=word/document.xml><?xml version="1.0" encoding="utf-8"?>
-<w:document xmlns:wpc="http://schemas.microsoft.com/office/word/2010/wordprocessingCanvas" xmlns:cx="http://schemas.microsoft.com/office/drawing/2014/chartex" xmlns:cx1="http://schemas.microsoft.com/office/drawing/2015/9/8/chartex" xmlns:cx2="http://schemas.microsoft.com/office/drawing/2015/10/21/chartex" xmlns:cx3="http://schemas.microsoft.com/office/drawing/2016/5/9/chartex" xmlns:cx4="http://schemas.microsoft.com/office/drawing/2016/5/10/chartex" xmlns:cx5="http://schemas.microsoft.com/office/drawing/2016/5/11/chartex" xmlns:cx6="http://schemas.microsoft.com/office/drawing/2016/5/12/chartex" xmlns:cx7="http://schemas.microsoft.com/office/drawing/2016/5/13/chartex" xmlns:cx8="http://schemas.microsoft.com/office/drawing/2016/5/14/chartex" xmlns:mc="http://schemas.openxmlformats.org/markup-compatibility/2006" xmlns:aink="http://schemas.microsoft.com/office/drawing/2016/ink" xmlns:am3d="http://schemas.microsoft.com/office/drawing/2017/model3d" xmlns:o="urn:schemas-microsoft-com:office:office" xmlns:oel="http://schemas.microsoft.com/office/2019/extlst" xmlns:r="http://schemas.openxmlformats.org/officeDocument/2006/relationships" xmlns:m="http://schemas.openxmlformats.org/officeDocument/2006/math" xmlns:v="urn:schemas-microsoft-com:vml" xmlns:wp14="http://schemas.microsoft.com/office/word/2010/wordprocessingDrawing" xmlns:wp="http://schemas.openxmlformats.org/drawingml/2006/wordprocessingDrawing" xmlns:w10="urn:schemas-microsoft-com:office:word" xmlns:w="http://schemas.openxmlformats.org/wordprocessingml/2006/main" xmlns:w14="http://schemas.microsoft.com/office/word/2010/wordml" xmlns:w15="http://schemas.microsoft.com/office/word/2012/wordml" xmlns:w16cei="http://schemas.microsoft.com/office/word/2026/wordml/cei" xmlns:w16cex="http://schemas.microsoft.com/office/word/2018/wordml/cex" xmlns:w16cid="http://schemas.microsoft.com/office/word/2016/wordml/cid" xmlns:w16="http://schemas.microsoft.com/office/word/2018/wordml" xmlns:w16du="http://schemas.microsoft.com/office/word/2023/wordml/word16du" xmlns:w16sdtdh="http://schemas.microsoft.com/office/word/2020/wordml/sdtdatahash" xmlns:w16sdtfl="http://schemas.microsoft.com/office/word/2024/wordml/sdtformatlock" xmlns:w16se="http://schemas.microsoft.com/office/word/2015/wordml/symex" xmlns:wpg="http://schemas.microsoft.com/office/word/2010/wordprocessingGroup" xmlns:wpi="http://schemas.microsoft.com/office/word/2010/wordprocessingInk" xmlns:wne="http://schemas.microsoft.com/office/word/2006/wordml" xmlns:wps="http://schemas.microsoft.com/office/word/2010/wordprocessingShape" mc:Ignorable="w14 w15 w16se w16cid w16 w16cex w16sdtdh w16sdtfl w16du wp14">
+<w:document xmlns:wpc="http://schemas.microsoft.com/office/word/2010/wordprocessingCanvas" xmlns:cx="http://schemas.microsoft.com/office/drawing/2014/chartex" xmlns:cx1="http://schemas.microsoft.com/office/drawing/2015/9/8/chartex" xmlns:cx2="http://schemas.microsoft.com/office/drawing/2015/10/21/chartex" xmlns:cx3="http://schemas.microsoft.com/office/drawing/2016/5/9/chartex" xmlns:cx4="http://schemas.microsoft.com/office/drawing/2016/5/10/chartex" xmlns:cx5="http://schemas.microsoft.com/office/drawing/2016/5/11/chartex" xmlns:cx6="http://schemas.microsoft.com/office/drawing/2016/5/12/chartex" xmlns:cx7="http://schemas.microsoft.com/office/drawing/2016/5/13/chartex" xmlns:cx8="http://schemas.microsoft.com/office/drawing/2016/5/14/chartex" xmlns:mc="http://schemas.openxmlformats.org/markup-compatibility/2006" xmlns:aink="http://schemas.microsoft.com/office/drawing/2016/ink" xmlns:am3d="http://schemas.microsoft.com/office/drawing/2017/model3d" xmlns:o="urn:schemas-microsoft-com:office:office" xmlns:oel="http://schemas.microsoft.com/office/2019/extlst" xmlns:r="http://schemas.openxmlformats.org/officeDocument/2006/relationships" xmlns:m="http://schemas.openxmlformats.org/officeDocument/2006/math" xmlns:v="urn:schemas-microsoft-com:vml" xmlns:wp14="http://schemas.microsoft.com/office/word/2010/wordprocessingDrawing" xmlns:wp="http://schemas.openxmlformats.org/drawingml/2006/wordprocessingDrawing" xmlns:w10="urn:schemas-microsoft-com:office:word" xmlns:w="http://schemas.openxmlformats.org/wordprocessingml/2006/main" xmlns:w14="http://schemas.microsoft.com/office/word/2010/wordml" xmlns:w15="http://schemas.microsoft.com/office/word/2012/wordml" xmlns:w16cex="http://schemas.microsoft.com/office/word/2018/wordml/cex" xmlns:w16cid="http://schemas.microsoft.com/office/word/2016/wordml/cid" xmlns:w16="http://schemas.microsoft.com/office/word/2018/wordml" xmlns:w16du="http://schemas.microsoft.com/office/word/2023/wordml/word16du" xmlns:w16sdtdh="http://schemas.microsoft.com/office/word/2020/wordml/sdtdatahash" xmlns:w16sdtfl="http://schemas.microsoft.com/office/word/2024/wordml/sdtformatlock" xmlns:w16se="http://schemas.microsoft.com/office/word/2015/wordml/symex" xmlns:wpg="http://schemas.microsoft.com/office/word/2010/wordprocessingGroup" xmlns:wpi="http://schemas.microsoft.com/office/word/2010/wordprocessingInk" xmlns:wne="http://schemas.microsoft.com/office/word/2006/wordml" xmlns:wps="http://schemas.microsoft.com/office/word/2010/wordprocessingShape" mc:Ignorable="w14 w15 w16se w16cid w16 w16cex w16sdtdh w16sdtfl w16du wp14">
   <w:body>
     <w:p>
       <w:pPr>
@@ -16140,25 +16140,7 @@
           <w:sz w:val="24"/>
           <w:szCs w:val="24"/>
         </w:rPr>
-        <w:t xml:space="preserve"> </w:t>
-      </w:r>
-      <w:proofErr w:type="spellStart"/>
-      <w:r>
-        <w:rPr>
-          <w:rFonts w:asciiTheme="minorHAnsi" w:hAnsiTheme="minorHAnsi" w:cstheme="minorHAnsi"/>
-          <w:sz w:val="24"/>
-          <w:szCs w:val="24"/>
-        </w:rPr>
-        <w:t>for</w:t>
-      </w:r>
-      <w:proofErr w:type="spellEnd"/>
-      <w:r>
-        <w:rPr>
-          <w:rFonts w:asciiTheme="minorHAnsi" w:hAnsiTheme="minorHAnsi" w:cstheme="minorHAnsi"/>
-          <w:sz w:val="24"/>
-          <w:szCs w:val="24"/>
-        </w:rPr>
-        <w:t xml:space="preserve"> </w:t>
+        <w:t xml:space="preserve"> for </w:t>
       </w:r>
       <w:proofErr w:type="spellStart"/>
       <w:r>
@@ -31854,6 +31836,10 @@
     <w:p>
       <w:pPr>
         <w:pStyle w:val="Textoindependiente"/>
+        <w:numPr>
+          <w:ilvl w:val="0"/>
+          <w:numId w:val="2"/>
+        </w:numPr>
         <w:spacing w:line="276" w:lineRule="auto"/>
         <w:ind w:right="93"/>
         <w:jc w:val="both"/>
@@ -31862,6 +31848,805 @@
           <w:spacing w:val="-2"/>
           <w:sz w:val="24"/>
           <w:szCs w:val="24"/>
+          <w:lang w:val="en-US"/>
+        </w:rPr>
+      </w:pPr>
+      <w:r>
+        <w:rPr>
+          <w:rFonts w:asciiTheme="minorHAnsi" w:hAnsiTheme="minorHAnsi" w:cstheme="minorHAnsi"/>
+          <w:spacing w:val="-2"/>
+          <w:sz w:val="24"/>
+          <w:szCs w:val="24"/>
+          <w:lang w:val="en-US"/>
+        </w:rPr>
+        <w:t xml:space="preserve">L. Layman, L. Williams, and L. Cunningham, “Motivations and measurements in an agile case study,” Journal of Systems Architecture, vol. 52, no. 11, pp. 654–667, 2006, </w:t>
+      </w:r>
+      <w:proofErr w:type="spellStart"/>
+      <w:r>
+        <w:rPr>
+          <w:rFonts w:asciiTheme="minorHAnsi" w:hAnsiTheme="minorHAnsi" w:cstheme="minorHAnsi"/>
+          <w:spacing w:val="-2"/>
+          <w:sz w:val="24"/>
+          <w:szCs w:val="24"/>
+          <w:lang w:val="en-US"/>
+        </w:rPr>
+        <w:t>doi</w:t>
+      </w:r>
+      <w:proofErr w:type="spellEnd"/>
+      <w:r>
+        <w:rPr>
+          <w:rFonts w:asciiTheme="minorHAnsi" w:hAnsiTheme="minorHAnsi" w:cstheme="minorHAnsi"/>
+          <w:spacing w:val="-2"/>
+          <w:sz w:val="24"/>
+          <w:szCs w:val="24"/>
+          <w:lang w:val="en-US"/>
+        </w:rPr>
+        <w:t>: 10.1016/j.sysarc.2006.06.009. </w:t>
+      </w:r>
+    </w:p>
+    <w:p>
+      <w:pPr>
+        <w:pStyle w:val="Textoindependiente"/>
+        <w:spacing w:line="276" w:lineRule="auto"/>
+        <w:ind w:right="93"/>
+        <w:jc w:val="both"/>
+        <w:rPr>
+          <w:rFonts w:asciiTheme="minorHAnsi" w:hAnsiTheme="minorHAnsi" w:cstheme="minorHAnsi"/>
+          <w:spacing w:val="-2"/>
+          <w:sz w:val="24"/>
+          <w:szCs w:val="24"/>
+          <w:lang w:val="es-MX"/>
+        </w:rPr>
+      </w:pPr>
+      <w:r>
+        <w:rPr>
+          <w:rFonts w:asciiTheme="minorHAnsi" w:hAnsiTheme="minorHAnsi" w:cstheme="minorHAnsi"/>
+          <w:spacing w:val="-2"/>
+          <w:sz w:val="24"/>
+          <w:szCs w:val="24"/>
+          <w:lang w:val="es-MX"/>
+        </w:rPr>
+        <w:t xml:space="preserve">Presenta un estudio de caso industrial sobre la adopción de prácticas de Extreme </w:t>
+      </w:r>
+      <w:proofErr w:type="spellStart"/>
+      <w:r>
+        <w:rPr>
+          <w:rFonts w:asciiTheme="minorHAnsi" w:hAnsiTheme="minorHAnsi" w:cstheme="minorHAnsi"/>
+          <w:spacing w:val="-2"/>
+          <w:sz w:val="24"/>
+          <w:szCs w:val="24"/>
+          <w:lang w:val="es-MX"/>
+        </w:rPr>
+        <w:t>Programming</w:t>
+      </w:r>
+      <w:proofErr w:type="spellEnd"/>
+      <w:r>
+        <w:rPr>
+          <w:rFonts w:asciiTheme="minorHAnsi" w:hAnsiTheme="minorHAnsi" w:cstheme="minorHAnsi"/>
+          <w:spacing w:val="-2"/>
+          <w:sz w:val="24"/>
+          <w:szCs w:val="24"/>
+          <w:lang w:val="es-MX"/>
+        </w:rPr>
+        <w:t xml:space="preserve"> (XP) en Sabre </w:t>
+      </w:r>
+      <w:proofErr w:type="spellStart"/>
+      <w:r>
+        <w:rPr>
+          <w:rFonts w:asciiTheme="minorHAnsi" w:hAnsiTheme="minorHAnsi" w:cstheme="minorHAnsi"/>
+          <w:spacing w:val="-2"/>
+          <w:sz w:val="24"/>
+          <w:szCs w:val="24"/>
+          <w:lang w:val="es-MX"/>
+        </w:rPr>
+        <w:t>Airline</w:t>
+      </w:r>
+      <w:proofErr w:type="spellEnd"/>
+      <w:r>
+        <w:rPr>
+          <w:rFonts w:asciiTheme="minorHAnsi" w:hAnsiTheme="minorHAnsi" w:cstheme="minorHAnsi"/>
+          <w:spacing w:val="-2"/>
+          <w:sz w:val="24"/>
+          <w:szCs w:val="24"/>
+          <w:lang w:val="es-MX"/>
+        </w:rPr>
+        <w:t xml:space="preserve"> </w:t>
+      </w:r>
+      <w:proofErr w:type="spellStart"/>
+      <w:r>
+        <w:rPr>
+          <w:rFonts w:asciiTheme="minorHAnsi" w:hAnsiTheme="minorHAnsi" w:cstheme="minorHAnsi"/>
+          <w:spacing w:val="-2"/>
+          <w:sz w:val="24"/>
+          <w:szCs w:val="24"/>
+          <w:lang w:val="es-MX"/>
+        </w:rPr>
+        <w:t>Solutions</w:t>
+      </w:r>
+      <w:proofErr w:type="spellEnd"/>
+      <w:r>
+        <w:rPr>
+          <w:rFonts w:asciiTheme="minorHAnsi" w:hAnsiTheme="minorHAnsi" w:cstheme="minorHAnsi"/>
+          <w:spacing w:val="-2"/>
+          <w:sz w:val="24"/>
+          <w:szCs w:val="24"/>
+          <w:lang w:val="es-MX"/>
+        </w:rPr>
+        <w:t>. El equipo obtuvo resultados de calidad posteriores a la liberación por encima del promedio y productividad entre promedio y superior al promedio</w:t>
+      </w:r>
+      <w:r>
+        <w:rPr>
+          <w:rFonts w:asciiTheme="minorHAnsi" w:hAnsiTheme="minorHAnsi" w:cstheme="minorHAnsi"/>
+          <w:spacing w:val="-2"/>
+          <w:sz w:val="24"/>
+          <w:szCs w:val="24"/>
+          <w:lang w:val="es-MX"/>
+        </w:rPr>
+        <w:t>.</w:t>
+      </w:r>
+    </w:p>
+    <w:p>
+      <w:pPr>
+        <w:pStyle w:val="Textoindependiente"/>
+        <w:spacing w:line="276" w:lineRule="auto"/>
+        <w:ind w:right="93"/>
+        <w:jc w:val="both"/>
+        <w:rPr>
+          <w:rFonts w:asciiTheme="minorHAnsi" w:hAnsiTheme="minorHAnsi" w:cstheme="minorHAnsi"/>
+          <w:spacing w:val="-2"/>
+          <w:sz w:val="24"/>
+          <w:szCs w:val="24"/>
+          <w:lang w:val="es-MX"/>
+        </w:rPr>
+      </w:pPr>
+      <w:r>
+        <w:rPr>
+          <w:rFonts w:asciiTheme="minorHAnsi" w:hAnsiTheme="minorHAnsi" w:cstheme="minorHAnsi"/>
+          <w:spacing w:val="-2"/>
+          <w:sz w:val="24"/>
+          <w:szCs w:val="24"/>
+          <w:lang w:val="es-MX"/>
+        </w:rPr>
+        <w:t>Es probablemente la mejor referencia para justificar XP. Puedes utilizarla para argumentar que XP ha sido estudiada en contextos reales y que sus prácticas pueden contribuir a la calidad y productividad.</w:t>
+      </w:r>
+    </w:p>
+    <w:p>
+      <w:pPr>
+        <w:pStyle w:val="paragraph"/>
+        <w:spacing w:before="0" w:beforeAutospacing="0" w:after="0" w:afterAutospacing="0"/>
+        <w:ind w:left="360"/>
+        <w:jc w:val="both"/>
+        <w:textAlignment w:val="baseline"/>
+        <w:rPr>
+          <w:rFonts w:ascii="Segoe UI" w:hAnsi="Segoe UI" w:cs="Segoe UI"/>
+          <w:sz w:val="18"/>
+          <w:szCs w:val="18"/>
+        </w:rPr>
+      </w:pPr>
+    </w:p>
+    <w:p>
+      <w:pPr>
+        <w:pStyle w:val="paragraph"/>
+        <w:numPr>
+          <w:ilvl w:val="0"/>
+          <w:numId w:val="2"/>
+        </w:numPr>
+        <w:spacing w:before="0" w:beforeAutospacing="0" w:after="0" w:afterAutospacing="0"/>
+        <w:jc w:val="both"/>
+        <w:textAlignment w:val="baseline"/>
+        <w:rPr>
+          <w:rFonts w:ascii="Verdana" w:hAnsi="Verdana" w:cs="Segoe UI"/>
+          <w:sz w:val="20"/>
+          <w:szCs w:val="20"/>
+        </w:rPr>
+      </w:pPr>
+      <w:r>
+        <w:rPr>
+          <w:rStyle w:val="normaltextrun"/>
+          <w:rFonts w:ascii="Verdana" w:hAnsi="Verdana" w:cs="Segoe UI"/>
+          <w:sz w:val="20"/>
+          <w:szCs w:val="20"/>
+          <w:lang w:val="en-US"/>
+        </w:rPr>
+        <w:t xml:space="preserve">[29] B. Rumpe and A. Schröder, “Quantitative survey on extreme programming projects,” in Proc. 3rd Int. Conf. </w:t>
+      </w:r>
+      <w:r>
+        <w:rPr>
+          <w:rStyle w:val="normaltextrun"/>
+          <w:rFonts w:ascii="Verdana" w:hAnsi="Verdana" w:cs="Segoe UI"/>
+          <w:sz w:val="20"/>
+          <w:szCs w:val="20"/>
+        </w:rPr>
+        <w:t xml:space="preserve">Extreme </w:t>
+      </w:r>
+      <w:proofErr w:type="spellStart"/>
+      <w:r>
+        <w:rPr>
+          <w:rStyle w:val="normaltextrun"/>
+          <w:rFonts w:ascii="Verdana" w:hAnsi="Verdana" w:cs="Segoe UI"/>
+          <w:sz w:val="20"/>
+          <w:szCs w:val="20"/>
+        </w:rPr>
+        <w:t>Programming</w:t>
+      </w:r>
+      <w:proofErr w:type="spellEnd"/>
+      <w:r>
+        <w:rPr>
+          <w:rStyle w:val="normaltextrun"/>
+          <w:rFonts w:ascii="Verdana" w:hAnsi="Verdana" w:cs="Segoe UI"/>
+          <w:sz w:val="20"/>
+          <w:szCs w:val="20"/>
+        </w:rPr>
+        <w:t xml:space="preserve"> and Flexible </w:t>
+      </w:r>
+      <w:proofErr w:type="spellStart"/>
+      <w:r>
+        <w:rPr>
+          <w:rStyle w:val="normaltextrun"/>
+          <w:rFonts w:ascii="Verdana" w:hAnsi="Verdana" w:cs="Segoe UI"/>
+          <w:sz w:val="20"/>
+          <w:szCs w:val="20"/>
+        </w:rPr>
+        <w:t>Processes</w:t>
+      </w:r>
+      <w:proofErr w:type="spellEnd"/>
+      <w:r>
+        <w:rPr>
+          <w:rStyle w:val="normaltextrun"/>
+          <w:rFonts w:ascii="Verdana" w:hAnsi="Verdana" w:cs="Segoe UI"/>
+          <w:sz w:val="20"/>
+          <w:szCs w:val="20"/>
+        </w:rPr>
+        <w:t xml:space="preserve"> in Software </w:t>
+      </w:r>
+      <w:proofErr w:type="spellStart"/>
+      <w:r>
+        <w:rPr>
+          <w:rStyle w:val="normaltextrun"/>
+          <w:rFonts w:ascii="Verdana" w:hAnsi="Verdana" w:cs="Segoe UI"/>
+          <w:sz w:val="20"/>
+          <w:szCs w:val="20"/>
+        </w:rPr>
+        <w:t>Engineering</w:t>
+      </w:r>
+      <w:proofErr w:type="spellEnd"/>
+      <w:r>
+        <w:rPr>
+          <w:rStyle w:val="normaltextrun"/>
+          <w:rFonts w:ascii="Verdana" w:hAnsi="Verdana" w:cs="Segoe UI"/>
+          <w:sz w:val="20"/>
+          <w:szCs w:val="20"/>
+        </w:rPr>
+        <w:t>, 2014.</w:t>
+      </w:r>
+      <w:r>
+        <w:t xml:space="preserve"> </w:t>
+      </w:r>
+    </w:p>
+    <w:p>
+      <w:pPr>
+        <w:pStyle w:val="paragraph"/>
+        <w:spacing w:before="0" w:beforeAutospacing="0" w:after="0" w:afterAutospacing="0"/>
+        <w:ind w:left="360"/>
+        <w:jc w:val="both"/>
+        <w:textAlignment w:val="baseline"/>
+        <w:rPr>
+          <w:rFonts w:ascii="Verdana" w:hAnsi="Verdana" w:cs="Segoe UI"/>
+          <w:sz w:val="20"/>
+          <w:szCs w:val="20"/>
+        </w:rPr>
+      </w:pPr>
+    </w:p>
+    <w:p>
+      <w:pPr>
+        <w:pStyle w:val="paragraph"/>
+        <w:spacing w:before="0" w:beforeAutospacing="0" w:after="0" w:afterAutospacing="0"/>
+        <w:ind w:left="360"/>
+        <w:jc w:val="both"/>
+        <w:textAlignment w:val="baseline"/>
+        <w:rPr>
+          <w:rStyle w:val="normaltextrun"/>
+          <w:rFonts w:asciiTheme="minorHAnsi" w:hAnsiTheme="minorHAnsi" w:cstheme="minorHAnsi"/>
+        </w:rPr>
+      </w:pPr>
+      <w:r>
+        <w:rPr>
+          <w:rStyle w:val="normaltextrun"/>
+          <w:rFonts w:asciiTheme="minorHAnsi" w:hAnsiTheme="minorHAnsi" w:cstheme="minorHAnsi"/>
+        </w:rPr>
+        <w:t>Estudia XP desde una perspectiva cuantitativa, analizando proyectos que utilizan prácticas de la metodología.</w:t>
+      </w:r>
+      <w:r>
+        <w:rPr>
+          <w:rStyle w:val="normaltextrun"/>
+          <w:rFonts w:asciiTheme="minorHAnsi" w:hAnsiTheme="minorHAnsi" w:cstheme="minorHAnsi"/>
+        </w:rPr>
+        <w:tab/>
+      </w:r>
+    </w:p>
+    <w:p>
+      <w:pPr>
+        <w:pStyle w:val="paragraph"/>
+        <w:spacing w:before="0" w:beforeAutospacing="0" w:after="0" w:afterAutospacing="0"/>
+        <w:ind w:left="360"/>
+        <w:jc w:val="both"/>
+        <w:textAlignment w:val="baseline"/>
+        <w:rPr>
+          <w:rStyle w:val="normaltextrun"/>
+          <w:rFonts w:asciiTheme="minorHAnsi" w:hAnsiTheme="minorHAnsi" w:cstheme="minorHAnsi"/>
+        </w:rPr>
+      </w:pPr>
+    </w:p>
+    <w:p>
+      <w:pPr>
+        <w:pStyle w:val="paragraph"/>
+        <w:spacing w:before="0" w:beforeAutospacing="0" w:after="0" w:afterAutospacing="0"/>
+        <w:ind w:left="360"/>
+        <w:jc w:val="both"/>
+        <w:textAlignment w:val="baseline"/>
+        <w:rPr>
+          <w:rStyle w:val="normaltextrun"/>
+          <w:rFonts w:asciiTheme="minorHAnsi" w:hAnsiTheme="minorHAnsi" w:cstheme="minorHAnsi"/>
+        </w:rPr>
+      </w:pPr>
+      <w:r>
+        <w:rPr>
+          <w:rStyle w:val="normaltextrun"/>
+          <w:rFonts w:asciiTheme="minorHAnsi" w:hAnsiTheme="minorHAnsi" w:cstheme="minorHAnsi"/>
+        </w:rPr>
+        <w:t>Te sirve para respaldar que la elección de XP no se basa únicamente en una preferencia metodológica, sino que existen estudios cuantitativos sobre su aplicación.</w:t>
+      </w:r>
+    </w:p>
+    <w:p>
+      <w:pPr>
+        <w:pStyle w:val="paragraph"/>
+        <w:spacing w:before="0" w:beforeAutospacing="0" w:after="0" w:afterAutospacing="0"/>
+        <w:ind w:left="360"/>
+        <w:jc w:val="both"/>
+        <w:textAlignment w:val="baseline"/>
+        <w:rPr>
+          <w:rFonts w:ascii="Segoe UI" w:hAnsi="Segoe UI" w:cs="Segoe UI"/>
+          <w:sz w:val="18"/>
+          <w:szCs w:val="18"/>
+          <w:lang w:val="es-ES"/>
+        </w:rPr>
+      </w:pPr>
+    </w:p>
+    <w:p>
+      <w:pPr>
+        <w:pStyle w:val="paragraph"/>
+        <w:spacing w:before="0" w:beforeAutospacing="0" w:after="0" w:afterAutospacing="0"/>
+        <w:ind w:left="360"/>
+        <w:jc w:val="both"/>
+        <w:textAlignment w:val="baseline"/>
+        <w:rPr>
+          <w:rFonts w:ascii="Segoe UI" w:hAnsi="Segoe UI" w:cs="Segoe UI"/>
+          <w:sz w:val="18"/>
+          <w:szCs w:val="18"/>
+        </w:rPr>
+      </w:pPr>
+    </w:p>
+    <w:p>
+      <w:pPr>
+        <w:pStyle w:val="paragraph"/>
+        <w:numPr>
+          <w:ilvl w:val="0"/>
+          <w:numId w:val="2"/>
+        </w:numPr>
+        <w:spacing w:before="0" w:beforeAutospacing="0" w:after="0" w:afterAutospacing="0"/>
+        <w:jc w:val="both"/>
+        <w:textAlignment w:val="baseline"/>
+        <w:rPr>
+          <w:rStyle w:val="normaltextrun"/>
+          <w:rFonts w:ascii="Segoe UI" w:hAnsi="Segoe UI" w:cs="Segoe UI"/>
+          <w:sz w:val="18"/>
+          <w:szCs w:val="18"/>
+          <w:lang w:val="en-US"/>
+        </w:rPr>
+      </w:pPr>
+      <w:r>
+        <w:rPr>
+          <w:rStyle w:val="normaltextrun"/>
+          <w:rFonts w:ascii="Verdana" w:hAnsi="Verdana" w:cs="Segoe UI"/>
+          <w:sz w:val="20"/>
+          <w:szCs w:val="20"/>
+          <w:lang w:val="en-US"/>
+        </w:rPr>
+        <w:lastRenderedPageBreak/>
+        <w:t xml:space="preserve">[30] T. </w:t>
+      </w:r>
+      <w:proofErr w:type="spellStart"/>
+      <w:r>
+        <w:rPr>
+          <w:rStyle w:val="normaltextrun"/>
+          <w:rFonts w:ascii="Verdana" w:hAnsi="Verdana" w:cs="Segoe UI"/>
+          <w:sz w:val="20"/>
+          <w:szCs w:val="20"/>
+          <w:lang w:val="en-US"/>
+        </w:rPr>
+        <w:t>Taipalus</w:t>
+      </w:r>
+      <w:proofErr w:type="spellEnd"/>
+      <w:r>
+        <w:rPr>
+          <w:rStyle w:val="normaltextrun"/>
+          <w:rFonts w:ascii="Verdana" w:hAnsi="Verdana" w:cs="Segoe UI"/>
+          <w:sz w:val="20"/>
+          <w:szCs w:val="20"/>
+          <w:lang w:val="en-US"/>
+        </w:rPr>
+        <w:t xml:space="preserve">, “Database management system performance comparisons: A systematic literature review,” Journal of Systems and Software, vol. 208, p. 111872, 2024, </w:t>
+      </w:r>
+      <w:proofErr w:type="spellStart"/>
+      <w:r>
+        <w:rPr>
+          <w:rStyle w:val="normaltextrun"/>
+          <w:rFonts w:ascii="Verdana" w:hAnsi="Verdana" w:cs="Segoe UI"/>
+          <w:sz w:val="20"/>
+          <w:szCs w:val="20"/>
+          <w:lang w:val="en-US"/>
+        </w:rPr>
+        <w:t>doi</w:t>
+      </w:r>
+      <w:proofErr w:type="spellEnd"/>
+      <w:r>
+        <w:rPr>
+          <w:rStyle w:val="normaltextrun"/>
+          <w:rFonts w:ascii="Verdana" w:hAnsi="Verdana" w:cs="Segoe UI"/>
+          <w:sz w:val="20"/>
+          <w:szCs w:val="20"/>
+          <w:lang w:val="en-US"/>
+        </w:rPr>
+        <w:t>: 10.1016/j.jss.2023.111872.</w:t>
+      </w:r>
+    </w:p>
+    <w:p>
+      <w:pPr>
+        <w:pStyle w:val="paragraph"/>
+        <w:spacing w:before="0" w:beforeAutospacing="0" w:after="0" w:afterAutospacing="0"/>
+        <w:ind w:left="360"/>
+        <w:jc w:val="both"/>
+        <w:textAlignment w:val="baseline"/>
+        <w:rPr>
+          <w:rStyle w:val="normaltextrun"/>
+          <w:rFonts w:ascii="Segoe UI" w:hAnsi="Segoe UI" w:cs="Segoe UI"/>
+          <w:sz w:val="18"/>
+          <w:szCs w:val="18"/>
+          <w:lang w:val="en-US"/>
+        </w:rPr>
+      </w:pPr>
+    </w:p>
+    <w:p>
+      <w:pPr>
+        <w:pStyle w:val="paragraph"/>
+        <w:spacing w:before="0" w:beforeAutospacing="0" w:after="0" w:afterAutospacing="0"/>
+        <w:ind w:left="360"/>
+        <w:jc w:val="both"/>
+        <w:textAlignment w:val="baseline"/>
+        <w:rPr>
+          <w:rFonts w:asciiTheme="minorHAnsi" w:hAnsiTheme="minorHAnsi" w:cstheme="minorHAnsi"/>
+          <w:lang w:val="es-ES"/>
+        </w:rPr>
+      </w:pPr>
+      <w:r>
+        <w:rPr>
+          <w:rFonts w:asciiTheme="minorHAnsi" w:hAnsiTheme="minorHAnsi" w:cstheme="minorHAnsi"/>
+          <w:lang w:val="es-ES"/>
+        </w:rPr>
+        <w:t xml:space="preserve">Revisión sistemática de investigaciones que comparan el rendimiento de diferentes sistemas gestores de bases de datos. Los autores advierten que muchos </w:t>
+      </w:r>
+      <w:proofErr w:type="spellStart"/>
+      <w:r>
+        <w:rPr>
+          <w:rFonts w:asciiTheme="minorHAnsi" w:hAnsiTheme="minorHAnsi" w:cstheme="minorHAnsi"/>
+          <w:lang w:val="es-ES"/>
+        </w:rPr>
+        <w:t>benchmarks</w:t>
+      </w:r>
+      <w:proofErr w:type="spellEnd"/>
+      <w:r>
+        <w:rPr>
+          <w:rFonts w:asciiTheme="minorHAnsi" w:hAnsiTheme="minorHAnsi" w:cstheme="minorHAnsi"/>
+          <w:lang w:val="es-ES"/>
+        </w:rPr>
+        <w:t xml:space="preserve"> no representan adecuadamente escenarios reales, por lo que las comparaciones deben interpretarse cuidadosamente.</w:t>
+      </w:r>
+      <w:r>
+        <w:rPr>
+          <w:rFonts w:asciiTheme="minorHAnsi" w:hAnsiTheme="minorHAnsi" w:cstheme="minorHAnsi"/>
+          <w:lang w:val="es-ES"/>
+        </w:rPr>
+        <w:tab/>
+      </w:r>
+    </w:p>
+    <w:p>
+      <w:pPr>
+        <w:pStyle w:val="paragraph"/>
+        <w:spacing w:before="0" w:beforeAutospacing="0" w:after="0" w:afterAutospacing="0"/>
+        <w:ind w:left="360"/>
+        <w:jc w:val="both"/>
+        <w:textAlignment w:val="baseline"/>
+        <w:rPr>
+          <w:rFonts w:asciiTheme="minorHAnsi" w:hAnsiTheme="minorHAnsi" w:cstheme="minorHAnsi"/>
+          <w:lang w:val="es-ES"/>
+        </w:rPr>
+      </w:pPr>
+    </w:p>
+    <w:p>
+      <w:pPr>
+        <w:pStyle w:val="paragraph"/>
+        <w:spacing w:before="0" w:beforeAutospacing="0" w:after="0" w:afterAutospacing="0"/>
+        <w:ind w:left="360"/>
+        <w:jc w:val="both"/>
+        <w:textAlignment w:val="baseline"/>
+        <w:rPr>
+          <w:rFonts w:asciiTheme="minorHAnsi" w:hAnsiTheme="minorHAnsi" w:cstheme="minorHAnsi"/>
+          <w:lang w:val="es-ES"/>
+        </w:rPr>
+      </w:pPr>
+      <w:r>
+        <w:rPr>
+          <w:rFonts w:asciiTheme="minorHAnsi" w:hAnsiTheme="minorHAnsi" w:cstheme="minorHAnsi"/>
+          <w:lang w:val="es-ES"/>
+        </w:rPr>
+        <w:t>Es excelente para tu marco de decisión tecnológica. Te permite evitar afirmar que PostgreSQL es universalmente “más rápido” y justificar que la selección debe responder a los requerimientos concretos de LITARO.</w:t>
+      </w:r>
+    </w:p>
+    <w:p>
+      <w:pPr>
+        <w:pStyle w:val="paragraph"/>
+        <w:spacing w:before="0" w:beforeAutospacing="0" w:after="0" w:afterAutospacing="0"/>
+        <w:ind w:left="360"/>
+        <w:jc w:val="both"/>
+        <w:textAlignment w:val="baseline"/>
+        <w:rPr>
+          <w:rFonts w:ascii="Segoe UI" w:hAnsi="Segoe UI" w:cs="Segoe UI"/>
+          <w:sz w:val="18"/>
+          <w:szCs w:val="18"/>
+        </w:rPr>
+      </w:pPr>
+    </w:p>
+    <w:p>
+      <w:pPr>
+        <w:pStyle w:val="paragraph"/>
+        <w:numPr>
+          <w:ilvl w:val="0"/>
+          <w:numId w:val="2"/>
+        </w:numPr>
+        <w:spacing w:before="0" w:beforeAutospacing="0" w:after="0" w:afterAutospacing="0"/>
+        <w:jc w:val="both"/>
+        <w:textAlignment w:val="baseline"/>
+        <w:rPr>
+          <w:rStyle w:val="eop"/>
+          <w:rFonts w:ascii="Segoe UI" w:hAnsi="Segoe UI" w:cs="Segoe UI"/>
+          <w:sz w:val="18"/>
+          <w:szCs w:val="18"/>
+          <w:lang w:val="es-ES"/>
+        </w:rPr>
+      </w:pPr>
+      <w:r>
+        <w:rPr>
+          <w:rStyle w:val="normaltextrun"/>
+          <w:rFonts w:ascii="Verdana" w:hAnsi="Verdana" w:cs="Segoe UI"/>
+          <w:sz w:val="20"/>
+          <w:szCs w:val="20"/>
+          <w:lang w:val="en-US"/>
+        </w:rPr>
+        <w:t xml:space="preserve">[31] “PostgreSQL”. PostgreSQL: The world's most advanced </w:t>
+      </w:r>
+      <w:proofErr w:type="gramStart"/>
+      <w:r>
+        <w:rPr>
+          <w:rStyle w:val="normaltextrun"/>
+          <w:rFonts w:ascii="Verdana" w:hAnsi="Verdana" w:cs="Segoe UI"/>
+          <w:sz w:val="20"/>
+          <w:szCs w:val="20"/>
+          <w:lang w:val="en-US"/>
+        </w:rPr>
+        <w:t>open source</w:t>
+      </w:r>
+      <w:proofErr w:type="gramEnd"/>
+      <w:r>
+        <w:rPr>
+          <w:rStyle w:val="normaltextrun"/>
+          <w:rFonts w:ascii="Verdana" w:hAnsi="Verdana" w:cs="Segoe UI"/>
+          <w:sz w:val="20"/>
+          <w:szCs w:val="20"/>
+          <w:lang w:val="en-US"/>
+        </w:rPr>
+        <w:t xml:space="preserve"> database. </w:t>
+      </w:r>
+      <w:r>
+        <w:rPr>
+          <w:rStyle w:val="normaltextrun"/>
+          <w:rFonts w:ascii="Verdana" w:hAnsi="Verdana" w:cs="Segoe UI"/>
+          <w:sz w:val="20"/>
+          <w:szCs w:val="20"/>
+          <w:lang w:val="es-ES"/>
+        </w:rPr>
+        <w:t xml:space="preserve">[En línea]. Disponible: </w:t>
+      </w:r>
+      <w:hyperlink r:id="rId5" w:tgtFrame="_blank" w:history="1">
+        <w:r>
+          <w:rPr>
+            <w:rStyle w:val="normaltextrun"/>
+            <w:rFonts w:ascii="Verdana" w:hAnsi="Verdana" w:cs="Segoe UI"/>
+            <w:sz w:val="20"/>
+            <w:szCs w:val="20"/>
+            <w:u w:val="single"/>
+            <w:lang w:val="es-ES"/>
+          </w:rPr>
+          <w:t>https://www.postgresql.org/about/</w:t>
+        </w:r>
+      </w:hyperlink>
+      <w:r>
+        <w:rPr>
+          <w:rStyle w:val="eop"/>
+          <w:rFonts w:ascii="Palatino" w:hAnsi="Palatino" w:cs="Segoe UI"/>
+          <w:sz w:val="19"/>
+          <w:szCs w:val="19"/>
+          <w:bdr w:val="none" w:sz="0" w:space="0" w:color="auto" w:frame="1"/>
+          <w:shd w:val="clear" w:color="auto" w:fill="C6C6C6"/>
+          <w:lang w:val="es-ES"/>
+        </w:rPr>
+        <w:t> </w:t>
+      </w:r>
+    </w:p>
+    <w:p>
+      <w:pPr>
+        <w:pStyle w:val="paragraph"/>
+        <w:spacing w:before="0" w:beforeAutospacing="0" w:after="0" w:afterAutospacing="0"/>
+        <w:ind w:left="360"/>
+        <w:jc w:val="both"/>
+        <w:textAlignment w:val="baseline"/>
+        <w:rPr>
+          <w:rStyle w:val="eop"/>
+          <w:rFonts w:ascii="Segoe UI" w:hAnsi="Segoe UI" w:cs="Segoe UI"/>
+          <w:sz w:val="18"/>
+          <w:szCs w:val="18"/>
+          <w:lang w:val="es-ES"/>
+        </w:rPr>
+      </w:pPr>
+    </w:p>
+    <w:p>
+      <w:pPr>
+        <w:pStyle w:val="paragraph"/>
+        <w:ind w:left="360"/>
+        <w:jc w:val="both"/>
+        <w:textAlignment w:val="baseline"/>
+        <w:rPr>
+          <w:rFonts w:ascii="Segoe UI" w:hAnsi="Segoe UI" w:cs="Segoe UI"/>
+          <w:sz w:val="20"/>
+          <w:szCs w:val="20"/>
+          <w:lang w:val="es-CO"/>
+        </w:rPr>
+      </w:pPr>
+      <w:r>
+        <w:rPr>
+          <w:rFonts w:ascii="Segoe UI" w:hAnsi="Segoe UI" w:cs="Segoe UI"/>
+          <w:sz w:val="20"/>
+          <w:szCs w:val="20"/>
+          <w:lang w:val="es-CO"/>
+        </w:rPr>
+        <w:t>Documentación oficial que describe PostgreSQL como un sistema objeto-relacional de código abierto, destacando arquitectura, confiabilidad, integridad de datos, extensibilidad, ACID, MVCC, particionamiento, seguridad y otros mecanismos.</w:t>
+      </w:r>
+      <w:r>
+        <w:rPr>
+          <w:rFonts w:ascii="Segoe UI" w:hAnsi="Segoe UI" w:cs="Segoe UI"/>
+          <w:sz w:val="20"/>
+          <w:szCs w:val="20"/>
+          <w:lang w:val="es-CO"/>
+        </w:rPr>
+        <w:tab/>
+      </w:r>
+    </w:p>
+    <w:p>
+      <w:pPr>
+        <w:pStyle w:val="paragraph"/>
+        <w:ind w:left="360"/>
+        <w:jc w:val="both"/>
+        <w:textAlignment w:val="baseline"/>
+        <w:rPr>
+          <w:rFonts w:ascii="Segoe UI" w:hAnsi="Segoe UI" w:cs="Segoe UI"/>
+          <w:sz w:val="20"/>
+          <w:szCs w:val="20"/>
+          <w:lang w:val="es-CO"/>
+        </w:rPr>
+      </w:pPr>
+      <w:r>
+        <w:rPr>
+          <w:rFonts w:ascii="Segoe UI" w:hAnsi="Segoe UI" w:cs="Segoe UI"/>
+          <w:sz w:val="20"/>
+          <w:szCs w:val="20"/>
+          <w:lang w:val="es-CO"/>
+        </w:rPr>
+        <w:t>Es la referencia principal para justificar por qué PostgreSQL técnicamente satisface las necesidades de LITARO: relaciones entre estudiantes, cursos, matrículas, docentes, evaluaciones, usuarios, etc.</w:t>
+      </w:r>
+    </w:p>
+    <w:p>
+      <w:pPr>
+        <w:pStyle w:val="paragraph"/>
+        <w:spacing w:before="0" w:beforeAutospacing="0" w:after="0" w:afterAutospacing="0"/>
+        <w:ind w:left="360"/>
+        <w:jc w:val="both"/>
+        <w:textAlignment w:val="baseline"/>
+        <w:rPr>
+          <w:rFonts w:ascii="Segoe UI" w:hAnsi="Segoe UI" w:cs="Segoe UI"/>
+          <w:sz w:val="20"/>
+          <w:szCs w:val="20"/>
+          <w:lang w:val="es-CO"/>
+        </w:rPr>
+      </w:pPr>
+      <w:r>
+        <w:rPr>
+          <w:rFonts w:ascii="Segoe UI" w:hAnsi="Segoe UI" w:cs="Segoe UI"/>
+          <w:sz w:val="20"/>
+          <w:szCs w:val="20"/>
+          <w:lang w:val="es-CO"/>
+        </w:rPr>
+        <w:t>Explica los mecanismos mediante los cuales PostgreSQL busca garantizar que las transacciones confirmadas permanezcan almacenadas de forma segura, incluso ante determinados fallos del sistema.</w:t>
+      </w:r>
+      <w:r>
+        <w:rPr>
+          <w:rFonts w:ascii="Segoe UI" w:hAnsi="Segoe UI" w:cs="Segoe UI"/>
+          <w:sz w:val="20"/>
+          <w:szCs w:val="20"/>
+          <w:lang w:val="es-CO"/>
+        </w:rPr>
+        <w:tab/>
+      </w:r>
+    </w:p>
+    <w:p>
+      <w:pPr>
+        <w:pStyle w:val="paragraph"/>
+        <w:spacing w:before="0" w:beforeAutospacing="0" w:after="0" w:afterAutospacing="0"/>
+        <w:ind w:left="360"/>
+        <w:jc w:val="both"/>
+        <w:textAlignment w:val="baseline"/>
+        <w:rPr>
+          <w:rFonts w:ascii="Segoe UI" w:hAnsi="Segoe UI" w:cs="Segoe UI"/>
+          <w:sz w:val="20"/>
+          <w:szCs w:val="20"/>
+          <w:lang w:val="es-CO"/>
+        </w:rPr>
+      </w:pPr>
+    </w:p>
+    <w:p>
+      <w:pPr>
+        <w:pStyle w:val="paragraph"/>
+        <w:spacing w:before="0" w:beforeAutospacing="0" w:after="0" w:afterAutospacing="0"/>
+        <w:ind w:left="360"/>
+        <w:jc w:val="both"/>
+        <w:textAlignment w:val="baseline"/>
+        <w:rPr>
+          <w:rFonts w:ascii="Segoe UI" w:hAnsi="Segoe UI" w:cs="Segoe UI"/>
+          <w:sz w:val="20"/>
+          <w:szCs w:val="20"/>
+          <w:lang w:val="es-CO"/>
+        </w:rPr>
+      </w:pPr>
+      <w:r>
+        <w:rPr>
+          <w:rFonts w:ascii="Segoe UI" w:hAnsi="Segoe UI" w:cs="Segoe UI"/>
+          <w:sz w:val="20"/>
+          <w:szCs w:val="20"/>
+          <w:lang w:val="es-CO"/>
+        </w:rPr>
+        <w:t>Muy buena para justificar confiabilidad e integridad de información académica. Por ejemplo, puedes relacionarla con matrículas, calificaciones y registros de estudiantes, donde perder o corromper información sería crítico.</w:t>
+      </w:r>
+    </w:p>
+    <w:p>
+      <w:pPr>
+        <w:pStyle w:val="Textoindependiente"/>
+        <w:spacing w:line="276" w:lineRule="auto"/>
+        <w:ind w:right="93"/>
+        <w:jc w:val="both"/>
+        <w:rPr>
+          <w:rFonts w:asciiTheme="minorHAnsi" w:hAnsiTheme="minorHAnsi" w:cstheme="minorHAnsi"/>
+          <w:spacing w:val="-2"/>
+          <w:sz w:val="24"/>
+          <w:szCs w:val="24"/>
+          <w:lang w:val="es-MX"/>
         </w:rPr>
       </w:pPr>
     </w:p>
@@ -32503,7 +33288,17 @@
           <w:sz w:val="24"/>
           <w:szCs w:val="24"/>
         </w:rPr>
-        <w:t>pedagógica entre profesores y la mejora continua del proceso de enseñanza.</w:t>
+        <w:t xml:space="preserve">pedagógica entre profesores y la mejora </w:t>
+      </w:r>
+      <w:r>
+        <w:rPr>
+          <w:rFonts w:asciiTheme="minorHAnsi" w:hAnsiTheme="minorHAnsi" w:cstheme="minorHAnsi"/>
+          <w:color w:val="EE0000"/>
+          <w:sz w:val="24"/>
+          <w:szCs w:val="24"/>
+        </w:rPr>
+        <w:lastRenderedPageBreak/>
+        <w:t>continua del proceso de enseñanza.</w:t>
       </w:r>
     </w:p>
     <w:p>
@@ -32987,17 +33782,7 @@
           <w:sz w:val="24"/>
           <w:szCs w:val="24"/>
         </w:rPr>
-        <w:t xml:space="preserve">organizacionales dentro de las instituciones educativas, existen referencias </w:t>
-      </w:r>
-      <w:r>
-        <w:rPr>
-          <w:rFonts w:asciiTheme="minorHAnsi" w:hAnsiTheme="minorHAnsi" w:cstheme="minorHAnsi"/>
-          <w:color w:val="EE0000"/>
-          <w:sz w:val="24"/>
-          <w:szCs w:val="24"/>
-        </w:rPr>
-        <w:lastRenderedPageBreak/>
-        <w:t>considerablemente más pertinentes para justificar la necesidad de implementar un sistema de información académico. Como director del proyecto, recomendaría reemplazar esta referencia por estudios relacionados directamente con sistemas de gestión académica, EMIS o transformación digital en instituciones escolares.</w:t>
+        <w:t>organizacionales dentro de las instituciones educativas, existen referencias considerablemente más pertinentes para justificar la necesidad de implementar un sistema de información académico. Como director del proyecto, recomendaría reemplazar esta referencia por estudios relacionados directamente con sistemas de gestión académica, EMIS o transformación digital en instituciones escolares.</w:t>
       </w:r>
     </w:p>
     <w:p>
@@ -33481,6 +34266,7 @@
           <w:sz w:val="24"/>
           <w:szCs w:val="24"/>
         </w:rPr>
+        <w:lastRenderedPageBreak/>
         <w:t>Nota</w:t>
       </w:r>
       <w:r>
@@ -34310,7 +35096,6 @@
           <w:sz w:val="24"/>
           <w:szCs w:val="24"/>
         </w:rPr>
-        <w:lastRenderedPageBreak/>
         <w:t>académica institucional, la administración de información, la comunicación entre actores educativos y la automatización de procesos administrativos, no en la gestión de contenidos educativos o plataformas de enseñanza virtual.</w:t>
       </w:r>
     </w:p>
@@ -35711,6 +36496,7 @@
           <w:szCs w:val="24"/>
           <w:lang w:val="es-CO"/>
         </w:rPr>
+        <w:lastRenderedPageBreak/>
         <w:t xml:space="preserve">    </w:t>
       </w:r>
       <w:r>
@@ -36270,7 +37056,6 @@
           <w:sz w:val="24"/>
           <w:szCs w:val="24"/>
         </w:rPr>
-        <w:lastRenderedPageBreak/>
         <w:t>Sin</w:t>
       </w:r>
       <w:r>
@@ -37977,6 +38762,7 @@
           <w:sz w:val="24"/>
           <w:szCs w:val="24"/>
         </w:rPr>
+        <w:lastRenderedPageBreak/>
         <w:t>Como consecuencia, la relación con la investigación resulta bastante indirecta. Sería más conveniente</w:t>
       </w:r>
       <w:r>
@@ -38577,7 +39363,6 @@
           <w:sz w:val="24"/>
           <w:szCs w:val="24"/>
         </w:rPr>
-        <w:lastRenderedPageBreak/>
         <w:t>Desarrollo:</w:t>
       </w:r>
     </w:p>
@@ -40497,7 +41282,17 @@
           <w:sz w:val="24"/>
           <w:szCs w:val="24"/>
         </w:rPr>
-        <w:t xml:space="preserve">el diseño o implementación de un Sistema de Información Académico ni presenta criterios para seleccionar tecnologías en proyectos institucionales reales. Su enfoque está orientado al proceso de enseñanza de bases de datos y no al desarrollo de soluciones para la gestión </w:t>
+        <w:t xml:space="preserve">el diseño o implementación de un Sistema de Información Académico ni </w:t>
+      </w:r>
+      <w:r>
+        <w:rPr>
+          <w:rFonts w:asciiTheme="minorHAnsi" w:hAnsiTheme="minorHAnsi" w:cstheme="minorHAnsi"/>
+          <w:color w:val="EE0000"/>
+          <w:sz w:val="24"/>
+          <w:szCs w:val="24"/>
+        </w:rPr>
+        <w:lastRenderedPageBreak/>
+        <w:t xml:space="preserve">presenta criterios para seleccionar tecnologías en proyectos institucionales reales. Su enfoque está orientado al proceso de enseñanza de bases de datos y no al desarrollo de soluciones para la gestión </w:t>
       </w:r>
       <w:r>
         <w:rPr>
@@ -40818,7 +41613,6 @@
           <w:sz w:val="24"/>
           <w:szCs w:val="24"/>
         </w:rPr>
-        <w:lastRenderedPageBreak/>
         <w:t>Hentea</w:t>
       </w:r>
       <w:proofErr w:type="spellEnd"/>
@@ -42444,7 +43238,16 @@
                 <w:sz w:val="20"/>
                 <w:szCs w:val="20"/>
               </w:rPr>
-              <w:t>https://www.sciencedirect.com/science/article/abs/pii/S1383762106000671</w:t>
+              <w:t>https://www.sciencedirect.c</w:t>
+            </w:r>
+            <w:r>
+              <w:rPr>
+                <w:rFonts w:asciiTheme="minorHAnsi" w:hAnsiTheme="minorHAnsi" w:cstheme="minorHAnsi"/>
+                <w:sz w:val="20"/>
+                <w:szCs w:val="20"/>
+              </w:rPr>
+              <w:lastRenderedPageBreak/>
+              <w:t>om/science/article/abs/pii/S1383762106000671</w:t>
             </w:r>
           </w:p>
         </w:tc>
@@ -42470,7 +43273,17 @@
                 <w:sz w:val="20"/>
                 <w:szCs w:val="20"/>
               </w:rPr>
-              <w:t xml:space="preserve">Presenta un estudio de caso industrial sobre la adopción de prácticas de Extreme </w:t>
+              <w:lastRenderedPageBreak/>
+              <w:t xml:space="preserve">Presenta un estudio de caso </w:t>
+            </w:r>
+            <w:r>
+              <w:rPr>
+                <w:rFonts w:asciiTheme="minorHAnsi" w:hAnsiTheme="minorHAnsi" w:cstheme="minorHAnsi"/>
+                <w:sz w:val="20"/>
+                <w:szCs w:val="20"/>
+              </w:rPr>
+              <w:lastRenderedPageBreak/>
+              <w:t xml:space="preserve">industrial sobre la adopción de prácticas de Extreme </w:t>
             </w:r>
             <w:proofErr w:type="spellStart"/>
             <w:r>
@@ -42550,7 +43363,17 @@
                 <w:sz w:val="20"/>
                 <w:szCs w:val="20"/>
               </w:rPr>
-              <w:t>Es probablemente la mejor referencia para justificar XP. Puedes utilizarla para argumentar que XP ha sido estudiada en contextos reales y que sus prácticas pueden contribuir a la calidad y productividad.</w:t>
+              <w:lastRenderedPageBreak/>
+              <w:t xml:space="preserve">Es probablemente la mejor </w:t>
+            </w:r>
+            <w:r>
+              <w:rPr>
+                <w:rFonts w:asciiTheme="minorHAnsi" w:hAnsiTheme="minorHAnsi" w:cstheme="minorHAnsi"/>
+                <w:sz w:val="20"/>
+                <w:szCs w:val="20"/>
+              </w:rPr>
+              <w:lastRenderedPageBreak/>
+              <w:t>referencia para justificar XP. Puedes utilizarla para argumentar que XP ha sido estudiada en contextos reales y que sus prácticas pueden contribuir a la calidad y productividad.</w:t>
             </w:r>
           </w:p>
         </w:tc>
@@ -42578,16 +43401,8 @@
                 <w:sz w:val="20"/>
                 <w:szCs w:val="20"/>
               </w:rPr>
-              <w:t>https://www.researchgate.net/publication/266024161_Q</w:t>
-            </w:r>
-            <w:r>
-              <w:rPr>
-                <w:rFonts w:asciiTheme="minorHAnsi" w:hAnsiTheme="minorHAnsi" w:cstheme="minorHAnsi"/>
-                <w:sz w:val="20"/>
-                <w:szCs w:val="20"/>
-              </w:rPr>
               <w:lastRenderedPageBreak/>
-              <w:t>uantitative_Survey_on_Extreme_Programming_Project</w:t>
+              <w:t>https://www.researchgate.net/publication/266024161_Quantitative_Survey_on_Extreme_Programming_Project</w:t>
             </w:r>
           </w:p>
         </w:tc>
@@ -42613,17 +43428,7 @@
                 <w:sz w:val="20"/>
                 <w:szCs w:val="20"/>
               </w:rPr>
-              <w:lastRenderedPageBreak/>
-              <w:t xml:space="preserve">Estudia XP desde una perspectiva cuantitativa, analizando proyectos </w:t>
-            </w:r>
-            <w:r>
-              <w:rPr>
-                <w:rFonts w:asciiTheme="minorHAnsi" w:hAnsiTheme="minorHAnsi" w:cstheme="minorHAnsi"/>
-                <w:sz w:val="20"/>
-                <w:szCs w:val="20"/>
-              </w:rPr>
-              <w:lastRenderedPageBreak/>
-              <w:t>que utilizan prácticas de la metodología.</w:t>
+              <w:t>Estudia XP desde una perspectiva cuantitativa, analizando proyectos que utilizan prácticas de la metodología.</w:t>
             </w:r>
           </w:p>
         </w:tc>
@@ -42649,17 +43454,7 @@
                 <w:sz w:val="20"/>
                 <w:szCs w:val="20"/>
               </w:rPr>
-              <w:lastRenderedPageBreak/>
-              <w:t xml:space="preserve">Te sirve para respaldar que la elección de XP no se basa </w:t>
-            </w:r>
-            <w:r>
-              <w:rPr>
-                <w:rFonts w:asciiTheme="minorHAnsi" w:hAnsiTheme="minorHAnsi" w:cstheme="minorHAnsi"/>
-                <w:sz w:val="20"/>
-                <w:szCs w:val="20"/>
-              </w:rPr>
-              <w:lastRenderedPageBreak/>
-              <w:t>únicamente en una preferencia metodológica, sino que existen estudios cuantitativos sobre su aplicación.</w:t>
+              <w:t>Te sirve para respaldar que la elección de XP no se basa únicamente en una preferencia metodológica, sino que existen estudios cuantitativos sobre su aplicación.</w:t>
             </w:r>
           </w:p>
         </w:tc>
@@ -42974,7 +43769,7 @@
 </file>
 
 <file path=word/numbering.xml><?xml version="1.0" encoding="utf-8"?>
-<w:numbering xmlns:wpc="http://schemas.microsoft.com/office/word/2010/wordprocessingCanvas" xmlns:cx="http://schemas.microsoft.com/office/drawing/2014/chartex" xmlns:cx1="http://schemas.microsoft.com/office/drawing/2015/9/8/chartex" xmlns:cx2="http://schemas.microsoft.com/office/drawing/2015/10/21/chartex" xmlns:cx3="http://schemas.microsoft.com/office/drawing/2016/5/9/chartex" xmlns:cx4="http://schemas.microsoft.com/office/drawing/2016/5/10/chartex" xmlns:cx5="http://schemas.microsoft.com/office/drawing/2016/5/11/chartex" xmlns:cx6="http://schemas.microsoft.com/office/drawing/2016/5/12/chartex" xmlns:cx7="http://schemas.microsoft.com/office/drawing/2016/5/13/chartex" xmlns:cx8="http://schemas.microsoft.com/office/drawing/2016/5/14/chartex" xmlns:mc="http://schemas.openxmlformats.org/markup-compatibility/2006" xmlns:aink="http://schemas.microsoft.com/office/drawing/2016/ink" xmlns:am3d="http://schemas.microsoft.com/office/drawing/2017/model3d" xmlns:o="urn:schemas-microsoft-com:office:office" xmlns:oel="http://schemas.microsoft.com/office/2019/extlst" xmlns:r="http://schemas.openxmlformats.org/officeDocument/2006/relationships" xmlns:m="http://schemas.openxmlformats.org/officeDocument/2006/math" xmlns:v="urn:schemas-microsoft-com:vml" xmlns:wp14="http://schemas.microsoft.com/office/word/2010/wordprocessingDrawing" xmlns:wp="http://schemas.openxmlformats.org/drawingml/2006/wordprocessingDrawing" xmlns:w10="urn:schemas-microsoft-com:office:word" xmlns:w="http://schemas.openxmlformats.org/wordprocessingml/2006/main" xmlns:w14="http://schemas.microsoft.com/office/word/2010/wordml" xmlns:w15="http://schemas.microsoft.com/office/word/2012/wordml" xmlns:w16cei="http://schemas.microsoft.com/office/word/2026/wordml/cei" xmlns:w16cex="http://schemas.microsoft.com/office/word/2018/wordml/cex" xmlns:w16cid="http://schemas.microsoft.com/office/word/2016/wordml/cid" xmlns:w16="http://schemas.microsoft.com/office/word/2018/wordml" xmlns:w16du="http://schemas.microsoft.com/office/word/2023/wordml/word16du" xmlns:w16sdtdh="http://schemas.microsoft.com/office/word/2020/wordml/sdtdatahash" xmlns:w16sdtfl="http://schemas.microsoft.com/office/word/2024/wordml/sdtformatlock" xmlns:w16se="http://schemas.microsoft.com/office/word/2015/wordml/symex" xmlns:wpg="http://schemas.microsoft.com/office/word/2010/wordprocessingGroup" xmlns:wpi="http://schemas.microsoft.com/office/word/2010/wordprocessingInk" xmlns:wne="http://schemas.microsoft.com/office/word/2006/wordml" xmlns:wps="http://schemas.microsoft.com/office/word/2010/wordprocessingShape" mc:Ignorable="w14 w15 w16se w16cid w16 w16cex w16sdtdh w16sdtfl w16du wp14">
+<w:numbering xmlns:wpc="http://schemas.microsoft.com/office/word/2010/wordprocessingCanvas" xmlns:cx="http://schemas.microsoft.com/office/drawing/2014/chartex" xmlns:cx1="http://schemas.microsoft.com/office/drawing/2015/9/8/chartex" xmlns:cx2="http://schemas.microsoft.com/office/drawing/2015/10/21/chartex" xmlns:cx3="http://schemas.microsoft.com/office/drawing/2016/5/9/chartex" xmlns:cx4="http://schemas.microsoft.com/office/drawing/2016/5/10/chartex" xmlns:cx5="http://schemas.microsoft.com/office/drawing/2016/5/11/chartex" xmlns:cx6="http://schemas.microsoft.com/office/drawing/2016/5/12/chartex" xmlns:cx7="http://schemas.microsoft.com/office/drawing/2016/5/13/chartex" xmlns:cx8="http://schemas.microsoft.com/office/drawing/2016/5/14/chartex" xmlns:mc="http://schemas.openxmlformats.org/markup-compatibility/2006" xmlns:aink="http://schemas.microsoft.com/office/drawing/2016/ink" xmlns:am3d="http://schemas.microsoft.com/office/drawing/2017/model3d" xmlns:o="urn:schemas-microsoft-com:office:office" xmlns:oel="http://schemas.microsoft.com/office/2019/extlst" xmlns:r="http://schemas.openxmlformats.org/officeDocument/2006/relationships" xmlns:m="http://schemas.openxmlformats.org/officeDocument/2006/math" xmlns:v="urn:schemas-microsoft-com:vml" xmlns:wp14="http://schemas.microsoft.com/office/word/2010/wordprocessingDrawing" xmlns:wp="http://schemas.openxmlformats.org/drawingml/2006/wordprocessingDrawing" xmlns:w10="urn:schemas-microsoft-com:office:word" xmlns:w="http://schemas.openxmlformats.org/wordprocessingml/2006/main" xmlns:w14="http://schemas.microsoft.com/office/word/2010/wordml" xmlns:w15="http://schemas.microsoft.com/office/word/2012/wordml" xmlns:w16cex="http://schemas.microsoft.com/office/word/2018/wordml/cex" xmlns:w16cid="http://schemas.microsoft.com/office/word/2016/wordml/cid" xmlns:w16="http://schemas.microsoft.com/office/word/2018/wordml" xmlns:w16du="http://schemas.microsoft.com/office/word/2023/wordml/word16du" xmlns:w16sdtdh="http://schemas.microsoft.com/office/word/2020/wordml/sdtdatahash" xmlns:w16sdtfl="http://schemas.microsoft.com/office/word/2024/wordml/sdtformatlock" xmlns:w16se="http://schemas.microsoft.com/office/word/2015/wordml/symex" xmlns:wpg="http://schemas.microsoft.com/office/word/2010/wordprocessingGroup" xmlns:wpi="http://schemas.microsoft.com/office/word/2010/wordprocessingInk" xmlns:wne="http://schemas.microsoft.com/office/word/2006/wordml" xmlns:wps="http://schemas.microsoft.com/office/word/2010/wordprocessingShape" mc:Ignorable="w14 w15 w16se w16cid w16 w16cex w16sdtdh w16sdtfl w16du wp14">
   <w:abstractNum w:abstractNumId="0" w15:restartNumberingAfterBreak="0">
     <w:nsid w:val="00381396"/>
     <w:multiLevelType w:val="hybridMultilevel"/>
@@ -43978,6 +44773,33 @@
       <w:shd w:val="clear" w:color="auto" w:fill="E1DFDD"/>
     </w:rPr>
   </w:style>
+  <w:style w:type="paragraph" w:customStyle="1" w:styleId="paragraph">
+    <w:name w:val="paragraph"/>
+    <w:basedOn w:val="Normal"/>
+    <w:rsid w:val="00F13EDA"/>
+    <w:pPr>
+      <w:widowControl/>
+      <w:autoSpaceDE/>
+      <w:autoSpaceDN/>
+      <w:spacing w:before="100" w:beforeAutospacing="1" w:after="100" w:afterAutospacing="1"/>
+    </w:pPr>
+    <w:rPr>
+      <w:rFonts w:ascii="Times New Roman" w:eastAsia="Times New Roman" w:hAnsi="Times New Roman" w:cs="Times New Roman"/>
+      <w:sz w:val="24"/>
+      <w:szCs w:val="24"/>
+      <w:lang w:val="es-MX" w:eastAsia="es-MX"/>
+    </w:rPr>
+  </w:style>
+  <w:style w:type="character" w:customStyle="1" w:styleId="normaltextrun">
+    <w:name w:val="normaltextrun"/>
+    <w:basedOn w:val="Fuentedeprrafopredeter"/>
+    <w:rsid w:val="00F13EDA"/>
+  </w:style>
+  <w:style w:type="character" w:customStyle="1" w:styleId="eop">
+    <w:name w:val="eop"/>
+    <w:basedOn w:val="Fuentedeprrafopredeter"/>
+    <w:rsid w:val="00F13EDA"/>
+  </w:style>
 </w:styles>
 </file>
 

</xml_diff>